<commit_message>
Finished the teacher app
</commit_message>
<xml_diff>
--- a/templates/docs/Agricultural Sciences.docx
+++ b/templates/docs/Agricultural Sciences.docx
@@ -1,13 +1,14 @@
 
 <file path=word/document.xml><?xml version="1.0" encoding="utf-8"?>
-<w:document xmlns:wpc="http://schemas.microsoft.com/office/word/2010/wordprocessingCanvas" xmlns:cx="http://schemas.microsoft.com/office/drawing/2014/chartex" xmlns:cx1="http://schemas.microsoft.com/office/drawing/2015/9/8/chartex" xmlns:cx2="http://schemas.microsoft.com/office/drawing/2015/10/21/chartex" xmlns:cx3="http://schemas.microsoft.com/office/drawing/2016/5/9/chartex" xmlns:cx4="http://schemas.microsoft.com/office/drawing/2016/5/10/chartex" xmlns:cx5="http://schemas.microsoft.com/office/drawing/2016/5/11/chartex" xmlns:cx6="http://schemas.microsoft.com/office/drawing/2016/5/12/chartex" xmlns:cx7="http://schemas.microsoft.com/office/drawing/2016/5/13/chartex" xmlns:cx8="http://schemas.microsoft.com/office/drawing/2016/5/14/chartex" xmlns:mc="http://schemas.openxmlformats.org/markup-compatibility/2006" xmlns:aink="http://schemas.microsoft.com/office/drawing/2016/ink" xmlns:am3d="http://schemas.microsoft.com/office/drawing/2017/model3d" xmlns:o="urn:schemas-microsoft-com:office:office" xmlns:oel="http://schemas.microsoft.com/office/2019/extlst" xmlns:r="http://schemas.openxmlformats.org/officeDocument/2006/relationships" xmlns:m="http://schemas.openxmlformats.org/officeDocument/2006/math" xmlns:v="urn:schemas-microsoft-com:vml" xmlns:wp14="http://schemas.microsoft.com/office/word/2010/wordprocessingDrawing" xmlns:wp="http://schemas.openxmlformats.org/drawingml/2006/wordprocessingDrawing" xmlns:w10="urn:schemas-microsoft-com:office:word" xmlns:w="http://schemas.openxmlformats.org/wordprocessingml/2006/main" xmlns:w14="http://schemas.microsoft.com/office/word/2010/wordml" xmlns:w15="http://schemas.microsoft.com/office/word/2012/wordml" xmlns:w16cex="http://schemas.microsoft.com/office/word/2018/wordml/cex" xmlns:w16cid="http://schemas.microsoft.com/office/word/2016/wordml/cid" xmlns:w16="http://schemas.microsoft.com/office/word/2018/wordml" xmlns:w16du="http://schemas.microsoft.com/office/word/2023/wordml/word16du" xmlns:w16sdtdh="http://schemas.microsoft.com/office/word/2020/wordml/sdtdatahash" xmlns:w16sdtfl="http://schemas.microsoft.com/office/word/2024/wordml/sdtformatlock" xmlns:w16se="http://schemas.microsoft.com/office/word/2015/wordml/symex" xmlns:wpg="http://schemas.microsoft.com/office/word/2010/wordprocessingGroup" xmlns:wpi="http://schemas.microsoft.com/office/word/2010/wordprocessingInk" xmlns:wne="http://schemas.microsoft.com/office/word/2006/wordml" xmlns:wps="http://schemas.microsoft.com/office/word/2010/wordprocessingShape" mc:Ignorable="w14 w15 w16se w16cid w16 w16cex w16sdtdh w16sdtfl w16du wp14">
+<w:document xmlns:o="urn:schemas-microsoft-com:office:office" xmlns:r="http://schemas.openxmlformats.org/officeDocument/2006/relationships" xmlns:v="urn:schemas-microsoft-com:vml" xmlns:w="http://schemas.openxmlformats.org/wordprocessingml/2006/main" xmlns:w10="urn:schemas-microsoft-com:office:word" xmlns:wp="http://schemas.openxmlformats.org/drawingml/2006/wordprocessingDrawing" xmlns:pic="http://schemas.openxmlformats.org/drawingml/2006/picture" xmlns:wps="http://schemas.microsoft.com/office/word/2010/wordprocessingShape" xmlns:wpg="http://schemas.microsoft.com/office/word/2010/wordprocessingGroup" xmlns:mc="http://schemas.openxmlformats.org/markup-compatibility/2006" xmlns:wp14="http://schemas.microsoft.com/office/word/2010/wordprocessingDrawing" xmlns:w14="http://schemas.microsoft.com/office/word/2010/wordml" xmlns:w15="http://schemas.microsoft.com/office/word/2012/wordml" mc:Ignorable="w14 wp14 w15">
   <w:body>
     <w:p>
       <w:pPr>
         <w:pStyle w:val="BodyText"/>
-        <w:spacing w:before="71"/>
-        <w:ind w:right="139"/>
-        <w:jc w:val="right"/>
+        <w:spacing w:before="71" w:after="0"/>
+        <w:ind w:end="139"/>
+        <w:jc w:val="end"/>
+        <w:rPr/>
       </w:pPr>
       <w:r>
         <w:rPr>
@@ -19,16 +20,22 @@
     <w:p>
       <w:pPr>
         <w:pStyle w:val="BodyText"/>
-        <w:spacing w:before="46"/>
+        <w:spacing w:before="46" w:after="0"/>
+        <w:rPr/>
       </w:pPr>
+      <w:r>
+        <w:rPr/>
+      </w:r>
     </w:p>
     <w:p>
       <w:pPr>
         <w:pStyle w:val="BodyText"/>
         <w:tabs>
-          <w:tab w:val="left" w:pos="861"/>
+          <w:tab w:val="clear" w:pos="720"/>
+          <w:tab w:val="left" w:pos="861" w:leader="none"/>
         </w:tabs>
-        <w:ind w:left="140"/>
+        <w:ind w:start="140"/>
+        <w:rPr/>
       </w:pPr>
       <w:r>
         <w:rPr>
@@ -37,6 +44,7 @@
         <w:t>1.2</w:t>
       </w:r>
       <w:r>
+        <w:rPr/>
         <w:tab/>
         <w:t>CANDIDATE'S</w:t>
       </w:r>
@@ -47,6 +55,7 @@
         <w:t xml:space="preserve"> </w:t>
       </w:r>
       <w:r>
+        <w:rPr/>
         <w:t>SBA</w:t>
       </w:r>
       <w:r>
@@ -56,6 +65,7 @@
         <w:t xml:space="preserve"> </w:t>
       </w:r>
       <w:r>
+        <w:rPr/>
         <w:t>COVER</w:t>
       </w:r>
       <w:r>
@@ -74,60 +84,69 @@
     <w:p>
       <w:pPr>
         <w:pStyle w:val="BodyText"/>
+        <w:rPr/>
       </w:pPr>
+      <w:r>
+        <w:rPr/>
+      </w:r>
     </w:p>
     <w:p>
       <w:pPr>
         <w:pStyle w:val="BodyText"/>
-        <w:spacing w:before="72"/>
+        <w:spacing w:before="72" w:after="0"/>
+        <w:rPr/>
       </w:pPr>
+      <w:r>
+        <w:rPr/>
+      </w:r>
     </w:p>
     <w:p>
       <w:pPr>
         <w:pStyle w:val="Title"/>
-        <w:spacing w:line="360" w:lineRule="auto"/>
+        <w:spacing w:lineRule="auto" w:line="360"/>
+        <w:rPr/>
       </w:pPr>
       <w:r>
-        <w:rPr>
-          <w:noProof/>
-        </w:rPr>
         <w:drawing>
-          <wp:anchor distT="0" distB="0" distL="0" distR="0" simplePos="0" relativeHeight="15729664" behindDoc="0" locked="0" layoutInCell="1" allowOverlap="1" wp14:anchorId="32BC6444" wp14:editId="005F449F">
+          <wp:anchor distT="0" distB="0" distL="0" distR="0" simplePos="0" relativeHeight="6" behindDoc="0" locked="0" layoutInCell="0" allowOverlap="1">
             <wp:simplePos x="0" y="0"/>
             <wp:positionH relativeFrom="page">
               <wp:posOffset>720090</wp:posOffset>
             </wp:positionH>
             <wp:positionV relativeFrom="paragraph">
-              <wp:posOffset>-157671</wp:posOffset>
+              <wp:posOffset>-157480</wp:posOffset>
             </wp:positionV>
-            <wp:extent cx="1219199" cy="827404"/>
+            <wp:extent cx="1219200" cy="827405"/>
             <wp:effectExtent l="0" t="0" r="0" b="0"/>
             <wp:wrapNone/>
-            <wp:docPr id="3" name="Image 3"/>
+            <wp:docPr id="1" name="Image 3"/>
             <wp:cNvGraphicFramePr>
-              <a:graphicFrameLocks xmlns:a="http://schemas.openxmlformats.org/drawingml/2006/main"/>
+              <a:graphicFrameLocks xmlns:a="http://schemas.openxmlformats.org/drawingml/2006/main" noChangeAspect="1"/>
             </wp:cNvGraphicFramePr>
             <a:graphic xmlns:a="http://schemas.openxmlformats.org/drawingml/2006/main">
               <a:graphicData uri="http://schemas.openxmlformats.org/drawingml/2006/picture">
                 <pic:pic xmlns:pic="http://schemas.openxmlformats.org/drawingml/2006/picture">
                   <pic:nvPicPr>
-                    <pic:cNvPr id="3" name="Image 3"/>
-                    <pic:cNvPicPr/>
+                    <pic:cNvPr id="1" name="Image 3"/>
+                    <pic:cNvPicPr>
+                      <a:picLocks noChangeAspect="1" noChangeArrowheads="1"/>
+                    </pic:cNvPicPr>
                   </pic:nvPicPr>
                   <pic:blipFill>
-                    <a:blip r:embed="rId6" cstate="print"/>
+                    <a:blip r:embed="rId2"/>
                     <a:stretch>
                       <a:fillRect/>
                     </a:stretch>
                   </pic:blipFill>
-                  <pic:spPr>
+                  <pic:spPr bwMode="auto">
                     <a:xfrm>
                       <a:off x="0" y="0"/>
-                      <a:ext cx="1219199" cy="827404"/>
+                      <a:ext cx="1219200" cy="827405"/>
                     </a:xfrm>
                     <a:prstGeom prst="rect">
                       <a:avLst/>
                     </a:prstGeom>
+                    <a:noFill/>
                   </pic:spPr>
                 </pic:pic>
               </a:graphicData>
@@ -136,6 +155,7 @@
         </w:drawing>
       </w:r>
       <w:r>
+        <w:rPr/>
         <w:t>NATIONAL</w:t>
       </w:r>
       <w:r>
@@ -145,6 +165,7 @@
         <w:t xml:space="preserve"> </w:t>
       </w:r>
       <w:r>
+        <w:rPr/>
         <w:t>SENIOR</w:t>
       </w:r>
       <w:r>
@@ -154,6 +175,7 @@
         <w:t xml:space="preserve"> </w:t>
       </w:r>
       <w:r>
+        <w:rPr/>
         <w:t>CERTIFICATE</w:t>
       </w:r>
       <w:r>
@@ -163,15 +185,18 @@
         <w:t xml:space="preserve"> </w:t>
       </w:r>
       <w:r>
+        <w:rPr/>
         <w:t>EXAMINATION AGRICULTURAL SCIENCES</w:t>
       </w:r>
     </w:p>
     <w:p>
       <w:pPr>
         <w:pStyle w:val="Title"/>
-        <w:ind w:right="185"/>
+        <w:ind w:start="2283" w:end="185"/>
+        <w:rPr/>
       </w:pPr>
       <w:r>
+        <w:rPr/>
         <w:t>COVER</w:t>
       </w:r>
       <w:r>
@@ -181,6 +206,7 @@
         <w:t xml:space="preserve"> </w:t>
       </w:r>
       <w:r>
+        <w:rPr/>
         <w:t>SHEET FOR</w:t>
       </w:r>
       <w:r>
@@ -190,6 +216,7 @@
         <w:t xml:space="preserve"> </w:t>
       </w:r>
       <w:r>
+        <w:rPr/>
         <w:t>LEARNER'S</w:t>
       </w:r>
       <w:r>
@@ -208,10 +235,12 @@
     <w:p>
       <w:pPr>
         <w:pStyle w:val="BodyText"/>
-        <w:spacing w:before="273"/>
-        <w:ind w:left="3355"/>
+        <w:spacing w:before="273" w:after="0"/>
+        <w:ind w:start="3355"/>
+        <w:rPr/>
       </w:pPr>
       <w:r>
+        <w:rPr/>
         <w:t>(To</w:t>
       </w:r>
       <w:r>
@@ -221,6 +250,7 @@
         <w:t xml:space="preserve"> </w:t>
       </w:r>
       <w:r>
+        <w:rPr/>
         <w:t>be</w:t>
       </w:r>
       <w:r>
@@ -230,6 +260,7 @@
         <w:t xml:space="preserve"> </w:t>
       </w:r>
       <w:r>
+        <w:rPr/>
         <w:t>filled</w:t>
       </w:r>
       <w:r>
@@ -239,6 +270,7 @@
         <w:t xml:space="preserve"> </w:t>
       </w:r>
       <w:r>
+        <w:rPr/>
         <w:t>in</w:t>
       </w:r>
       <w:r>
@@ -248,6 +280,7 @@
         <w:t xml:space="preserve"> </w:t>
       </w:r>
       <w:r>
+        <w:rPr/>
         <w:t>by</w:t>
       </w:r>
       <w:r>
@@ -257,6 +290,7 @@
         <w:t xml:space="preserve"> </w:t>
       </w:r>
       <w:r>
+        <w:rPr/>
         <w:t>the</w:t>
       </w:r>
       <w:r>
@@ -266,6 +300,7 @@
         <w:t xml:space="preserve"> </w:t>
       </w:r>
       <w:r>
+        <w:rPr/>
         <w:t>candidate</w:t>
       </w:r>
       <w:r>
@@ -275,6 +310,7 @@
         <w:t xml:space="preserve"> </w:t>
       </w:r>
       <w:r>
+        <w:rPr/>
         <w:t>and</w:t>
       </w:r>
       <w:r>
@@ -284,6 +320,7 @@
         <w:t xml:space="preserve"> </w:t>
       </w:r>
       <w:r>
+        <w:rPr/>
         <w:t>controlled</w:t>
       </w:r>
       <w:r>
@@ -293,6 +330,7 @@
         <w:t xml:space="preserve"> </w:t>
       </w:r>
       <w:r>
+        <w:rPr/>
         <w:t>by</w:t>
       </w:r>
       <w:r>
@@ -302,6 +340,7 @@
         <w:t xml:space="preserve"> </w:t>
       </w:r>
       <w:r>
+        <w:rPr/>
         <w:t>the</w:t>
       </w:r>
       <w:r>
@@ -319,21 +358,36 @@
     </w:p>
     <w:p>
       <w:pPr>
-        <w:spacing w:before="303" w:line="199" w:lineRule="exact"/>
+        <w:pStyle w:val="Normal"/>
+        <w:spacing w:lineRule="exact" w:line="199" w:before="303" w:after="0"/>
         <w:rPr>
-          <w:noProof/>
           <w:color w:val="000000"/>
           <w:sz w:val="24"/>
           <w:szCs w:val="24"/>
         </w:rPr>
       </w:pPr>
+      <w:r>
+        <w:rPr>
+          <w:color w:val="000000"/>
+          <w:sz w:val="24"/>
+          <w:szCs w:val="24"/>
+        </w:rPr>
+      </w:r>
     </w:p>
     <w:tbl>
       <w:tblPr>
         <w:tblStyle w:val="TableGrid"/>
-        <w:tblW w:w="0" w:type="auto"/>
+        <w:tblW w:w="9621" w:type="dxa"/>
+        <w:jc w:val="start"/>
         <w:tblInd w:w="142" w:type="dxa"/>
-        <w:tblLook w:val="04A0" w:firstRow="1" w:lastRow="0" w:firstColumn="1" w:lastColumn="0" w:noHBand="0" w:noVBand="1"/>
+        <w:tblLayout w:type="fixed"/>
+        <w:tblCellMar>
+          <w:top w:w="0" w:type="dxa"/>
+          <w:start w:w="108" w:type="dxa"/>
+          <w:bottom w:w="0" w:type="dxa"/>
+          <w:end w:w="108" w:type="dxa"/>
+        </w:tblCellMar>
+        <w:tblLook w:val="04a0" w:firstRow="1" w:noVBand="1" w:lastRow="0" w:firstColumn="1" w:lastColumn="0" w:noHBand="0"/>
       </w:tblPr>
       <w:tblGrid>
         <w:gridCol w:w="1924"/>
@@ -342,21 +396,24 @@
         <w:gridCol w:w="2728"/>
       </w:tblGrid>
       <w:tr>
+        <w:trPr/>
         <w:tc>
           <w:tcPr>
             <w:tcW w:w="1924" w:type="dxa"/>
             <w:tcBorders>
               <w:top w:val="nil"/>
-              <w:left w:val="nil"/>
+              <w:start w:val="nil"/>
               <w:bottom w:val="nil"/>
             </w:tcBorders>
             <w:vAlign w:val="center"/>
           </w:tcPr>
           <w:p>
             <w:pPr>
-              <w:spacing w:line="376" w:lineRule="exact"/>
-              <w:rPr>
-                <w:noProof/>
+              <w:pStyle w:val="Normal"/>
+              <w:widowControl/>
+              <w:spacing w:lineRule="exact" w:line="376" w:before="0" w:after="0"/>
+              <w:jc w:val="start"/>
+              <w:rPr>
                 <w:color w:val="000000"/>
                 <w:spacing w:val="1"/>
                 <w:sz w:val="24"/>
@@ -365,11 +422,12 @@
             </w:pPr>
             <w:r>
               <w:rPr>
-                <w:noProof/>
                 <w:color w:val="000000"/>
                 <w:spacing w:val="1"/>
-                <w:sz w:val="24"/>
-                <w:szCs w:val="24"/>
+                <w:kern w:val="0"/>
+                <w:sz w:val="24"/>
+                <w:szCs w:val="24"/>
+                <w:lang w:val="en-US" w:eastAsia="en-US" w:bidi="ar-SA"/>
               </w:rPr>
               <w:t>Center Number</w:t>
             </w:r>
@@ -378,14 +436,16 @@
         <w:tc>
           <w:tcPr>
             <w:tcW w:w="2056" w:type="dxa"/>
+            <w:tcBorders/>
             <w:vAlign w:val="center"/>
           </w:tcPr>
           <w:p>
             <w:pPr>
-              <w:spacing w:line="376" w:lineRule="exact"/>
+              <w:pStyle w:val="Normal"/>
+              <w:widowControl/>
+              <w:spacing w:lineRule="exact" w:line="376" w:before="0" w:after="0"/>
               <w:jc w:val="center"/>
               <w:rPr>
-                <w:noProof/>
                 <w:color w:val="000000"/>
                 <w:spacing w:val="1"/>
                 <w:sz w:val="24"/>
@@ -394,11 +454,12 @@
             </w:pPr>
             <w:r>
               <w:rPr>
-                <w:noProof/>
                 <w:color w:val="000000"/>
                 <w:spacing w:val="1"/>
-                <w:sz w:val="24"/>
-                <w:szCs w:val="24"/>
+                <w:kern w:val="0"/>
+                <w:sz w:val="24"/>
+                <w:szCs w:val="24"/>
+                <w:lang w:val="en-US" w:eastAsia="en-US" w:bidi="ar-SA"/>
               </w:rPr>
               <w:t>{CENTER_NUM}</w:t>
             </w:r>
@@ -414,10 +475,11 @@
           </w:tcPr>
           <w:p>
             <w:pPr>
-              <w:spacing w:line="376" w:lineRule="exact"/>
-              <w:jc w:val="right"/>
-              <w:rPr>
-                <w:noProof/>
+              <w:pStyle w:val="Normal"/>
+              <w:widowControl/>
+              <w:spacing w:lineRule="exact" w:line="376" w:before="0" w:after="0"/>
+              <w:jc w:val="end"/>
+              <w:rPr>
                 <w:color w:val="000000"/>
                 <w:spacing w:val="1"/>
                 <w:sz w:val="24"/>
@@ -426,11 +488,12 @@
             </w:pPr>
             <w:r>
               <w:rPr>
-                <w:noProof/>
                 <w:color w:val="000000"/>
                 <w:spacing w:val="1"/>
-                <w:sz w:val="24"/>
-                <w:szCs w:val="24"/>
+                <w:kern w:val="0"/>
+                <w:sz w:val="24"/>
+                <w:szCs w:val="24"/>
+                <w:lang w:val="en-US" w:eastAsia="en-US" w:bidi="ar-SA"/>
               </w:rPr>
               <w:t>Candidate’s Examination number</w:t>
             </w:r>
@@ -439,14 +502,16 @@
         <w:tc>
           <w:tcPr>
             <w:tcW w:w="2728" w:type="dxa"/>
+            <w:tcBorders/>
             <w:vAlign w:val="center"/>
           </w:tcPr>
           <w:p>
             <w:pPr>
-              <w:spacing w:line="376" w:lineRule="exact"/>
+              <w:pStyle w:val="Normal"/>
+              <w:widowControl/>
+              <w:spacing w:lineRule="exact" w:line="376" w:before="0" w:after="0"/>
               <w:jc w:val="center"/>
               <w:rPr>
-                <w:noProof/>
                 <w:color w:val="000000"/>
                 <w:spacing w:val="1"/>
                 <w:sz w:val="24"/>
@@ -455,11 +520,12 @@
             </w:pPr>
             <w:r>
               <w:rPr>
-                <w:noProof/>
                 <w:color w:val="000000"/>
                 <w:spacing w:val="1"/>
-                <w:sz w:val="24"/>
-                <w:szCs w:val="24"/>
+                <w:kern w:val="0"/>
+                <w:sz w:val="24"/>
+                <w:szCs w:val="24"/>
+                <w:lang w:val="en-US" w:eastAsia="en-US" w:bidi="ar-SA"/>
               </w:rPr>
               <w:t>{EXAM_NUM}</w:t>
             </w:r>
@@ -470,73 +536,88 @@
     <w:p>
       <w:pPr>
         <w:pStyle w:val="BodyText"/>
+        <w:rPr/>
       </w:pPr>
+      <w:r>
+        <w:rPr/>
+      </w:r>
     </w:p>
     <w:p>
       <w:pPr>
         <w:pStyle w:val="BodyText"/>
-        <w:spacing w:before="29"/>
+        <w:spacing w:before="29" w:after="0"/>
+        <w:rPr/>
       </w:pPr>
+      <w:r>
+        <w:rPr/>
+      </w:r>
     </w:p>
     <w:tbl>
       <w:tblPr>
-        <w:tblW w:w="0" w:type="auto"/>
+        <w:tblW w:w="9634" w:type="dxa"/>
+        <w:jc w:val="start"/>
         <w:tblInd w:w="148" w:type="dxa"/>
-        <w:tblBorders>
-          <w:top w:val="single" w:sz="6" w:space="0" w:color="000000"/>
-          <w:left w:val="single" w:sz="6" w:space="0" w:color="000000"/>
-          <w:bottom w:val="single" w:sz="6" w:space="0" w:color="000000"/>
-          <w:right w:val="single" w:sz="6" w:space="0" w:color="000000"/>
-          <w:insideH w:val="single" w:sz="6" w:space="0" w:color="000000"/>
-          <w:insideV w:val="single" w:sz="6" w:space="0" w:color="000000"/>
-        </w:tblBorders>
         <w:tblLayout w:type="fixed"/>
         <w:tblCellMar>
-          <w:left w:w="0" w:type="dxa"/>
-          <w:right w:w="0" w:type="dxa"/>
+          <w:top w:w="0" w:type="dxa"/>
+          <w:start w:w="0" w:type="dxa"/>
+          <w:bottom w:w="0" w:type="dxa"/>
+          <w:end w:w="7" w:type="dxa"/>
         </w:tblCellMar>
-        <w:tblLook w:val="01E0" w:firstRow="1" w:lastRow="1" w:firstColumn="1" w:lastColumn="1" w:noHBand="0" w:noVBand="0"/>
+        <w:tblLook w:val="01e0" w:firstRow="1" w:noVBand="0" w:lastRow="1" w:firstColumn="1" w:lastColumn="1" w:noHBand="0"/>
       </w:tblPr>
       <w:tblGrid>
-        <w:gridCol w:w="1714"/>
-        <w:gridCol w:w="365"/>
+        <w:gridCol w:w="1713"/>
+        <w:gridCol w:w="366"/>
         <w:gridCol w:w="3702"/>
-        <w:gridCol w:w="1277"/>
-        <w:gridCol w:w="1280"/>
+        <w:gridCol w:w="1276"/>
+        <w:gridCol w:w="1281"/>
         <w:gridCol w:w="1296"/>
       </w:tblGrid>
       <w:tr>
         <w:trPr>
-          <w:trHeight w:val="739"/>
+          <w:trHeight w:val="739" w:hRule="atLeast"/>
         </w:trPr>
         <w:tc>
           <w:tcPr>
             <w:tcW w:w="2079" w:type="dxa"/>
             <w:gridSpan w:val="2"/>
             <w:tcBorders>
-              <w:top w:val="nil"/>
-              <w:left w:val="nil"/>
-            </w:tcBorders>
-          </w:tcPr>
-          <w:p>
-            <w:pPr>
-              <w:pStyle w:val="TableParagraph"/>
-              <w:rPr>
-                <w:rFonts w:ascii="Times New Roman"/>
+              <w:bottom w:val="single" w:sz="6" w:space="0" w:color="000000"/>
+              <w:end w:val="single" w:sz="6" w:space="0" w:color="000000"/>
+            </w:tcBorders>
+          </w:tcPr>
+          <w:p>
+            <w:pPr>
+              <w:pStyle w:val="TableParagraph"/>
+              <w:rPr>
+                <w:rFonts w:ascii="Times New Roman" w:hAnsi="Times New Roman"/>
                 <w:sz w:val="20"/>
               </w:rPr>
             </w:pPr>
+            <w:r>
+              <w:rPr>
+                <w:rFonts w:ascii="Times New Roman" w:hAnsi="Times New Roman"/>
+                <w:sz w:val="20"/>
+              </w:rPr>
+            </w:r>
           </w:p>
         </w:tc>
         <w:tc>
           <w:tcPr>
             <w:tcW w:w="3702" w:type="dxa"/>
-          </w:tcPr>
-          <w:p>
-            <w:pPr>
-              <w:pStyle w:val="TableParagraph"/>
-              <w:spacing w:before="231"/>
-              <w:ind w:left="1022"/>
+            <w:tcBorders>
+              <w:top w:val="single" w:sz="6" w:space="0" w:color="000000"/>
+              <w:start w:val="single" w:sz="6" w:space="0" w:color="000000"/>
+              <w:bottom w:val="single" w:sz="6" w:space="0" w:color="000000"/>
+              <w:end w:val="single" w:sz="6" w:space="0" w:color="000000"/>
+            </w:tcBorders>
+          </w:tcPr>
+          <w:p>
+            <w:pPr>
+              <w:pStyle w:val="TableParagraph"/>
+              <w:spacing w:before="231" w:after="0"/>
+              <w:ind w:start="1022"/>
               <w:rPr>
                 <w:b/>
                 <w:sz w:val="24"/>
@@ -554,13 +635,19 @@
         </w:tc>
         <w:tc>
           <w:tcPr>
-            <w:tcW w:w="1277" w:type="dxa"/>
-          </w:tcPr>
-          <w:p>
-            <w:pPr>
-              <w:pStyle w:val="TableParagraph"/>
-              <w:spacing w:before="231"/>
-              <w:ind w:left="378"/>
+            <w:tcW w:w="1276" w:type="dxa"/>
+            <w:tcBorders>
+              <w:top w:val="single" w:sz="6" w:space="0" w:color="000000"/>
+              <w:start w:val="single" w:sz="6" w:space="0" w:color="000000"/>
+              <w:bottom w:val="single" w:sz="6" w:space="0" w:color="000000"/>
+              <w:end w:val="single" w:sz="6" w:space="0" w:color="000000"/>
+            </w:tcBorders>
+          </w:tcPr>
+          <w:p>
+            <w:pPr>
+              <w:pStyle w:val="TableParagraph"/>
+              <w:spacing w:before="231" w:after="0"/>
+              <w:ind w:start="378"/>
               <w:rPr>
                 <w:b/>
                 <w:sz w:val="24"/>
@@ -578,13 +665,19 @@
         </w:tc>
         <w:tc>
           <w:tcPr>
-            <w:tcW w:w="1280" w:type="dxa"/>
-          </w:tcPr>
-          <w:p>
-            <w:pPr>
-              <w:pStyle w:val="TableParagraph"/>
-              <w:spacing w:before="94"/>
-              <w:ind w:left="306" w:right="288" w:firstLine="86"/>
+            <w:tcW w:w="1281" w:type="dxa"/>
+            <w:tcBorders>
+              <w:top w:val="single" w:sz="6" w:space="0" w:color="000000"/>
+              <w:start w:val="single" w:sz="6" w:space="0" w:color="000000"/>
+              <w:bottom w:val="single" w:sz="6" w:space="0" w:color="000000"/>
+              <w:end w:val="single" w:sz="6" w:space="0" w:color="000000"/>
+            </w:tcBorders>
+          </w:tcPr>
+          <w:p>
+            <w:pPr>
+              <w:pStyle w:val="TableParagraph"/>
+              <w:spacing w:before="94" w:after="0"/>
+              <w:ind w:firstLine="86" w:start="306" w:end="288"/>
               <w:rPr>
                 <w:b/>
                 <w:sz w:val="24"/>
@@ -611,12 +704,18 @@
         <w:tc>
           <w:tcPr>
             <w:tcW w:w="1296" w:type="dxa"/>
-          </w:tcPr>
-          <w:p>
-            <w:pPr>
-              <w:pStyle w:val="TableParagraph"/>
-              <w:spacing w:before="94"/>
-              <w:ind w:left="366" w:right="92" w:hanging="260"/>
+            <w:tcBorders>
+              <w:top w:val="single" w:sz="6" w:space="0" w:color="000000"/>
+              <w:start w:val="single" w:sz="6" w:space="0" w:color="000000"/>
+              <w:bottom w:val="single" w:sz="6" w:space="0" w:color="000000"/>
+              <w:end w:val="single" w:sz="6" w:space="0" w:color="000000"/>
+            </w:tcBorders>
+          </w:tcPr>
+          <w:p>
+            <w:pPr>
+              <w:pStyle w:val="TableParagraph"/>
+              <w:spacing w:before="94" w:after="0"/>
+              <w:ind w:hanging="260" w:start="366" w:end="92"/>
               <w:rPr>
                 <w:b/>
                 <w:sz w:val="24"/>
@@ -643,27 +742,39 @@
       </w:tr>
       <w:tr>
         <w:trPr>
-          <w:trHeight w:val="736"/>
+          <w:trHeight w:val="736" w:hRule="atLeast"/>
         </w:trPr>
         <w:tc>
           <w:tcPr>
-            <w:tcW w:w="1714" w:type="dxa"/>
+            <w:tcW w:w="1713" w:type="dxa"/>
             <w:vMerge w:val="restart"/>
-          </w:tcPr>
-          <w:p>
-            <w:pPr>
-              <w:pStyle w:val="TableParagraph"/>
-              <w:spacing w:before="192"/>
-              <w:rPr>
-                <w:rFonts w:ascii="Arial MT"/>
-                <w:sz w:val="24"/>
-              </w:rPr>
-            </w:pPr>
-          </w:p>
-          <w:p>
-            <w:pPr>
-              <w:pStyle w:val="TableParagraph"/>
-              <w:ind w:left="110"/>
+            <w:tcBorders>
+              <w:top w:val="single" w:sz="6" w:space="0" w:color="000000"/>
+              <w:start w:val="single" w:sz="6" w:space="0" w:color="000000"/>
+              <w:bottom w:val="single" w:sz="6" w:space="0" w:color="000000"/>
+              <w:end w:val="single" w:sz="6" w:space="0" w:color="000000"/>
+            </w:tcBorders>
+          </w:tcPr>
+          <w:p>
+            <w:pPr>
+              <w:pStyle w:val="TableParagraph"/>
+              <w:spacing w:before="192" w:after="0"/>
+              <w:rPr>
+                <w:rFonts w:ascii="Arial MT" w:hAnsi="Arial MT"/>
+                <w:sz w:val="24"/>
+              </w:rPr>
+            </w:pPr>
+            <w:r>
+              <w:rPr>
+                <w:rFonts w:ascii="Arial MT" w:hAnsi="Arial MT"/>
+                <w:sz w:val="24"/>
+              </w:rPr>
+            </w:r>
+          </w:p>
+          <w:p>
+            <w:pPr>
+              <w:pStyle w:val="TableParagraph"/>
+              <w:ind w:start="110"/>
               <w:rPr>
                 <w:b/>
                 <w:sz w:val="24"/>
@@ -681,43 +792,61 @@
         </w:tc>
         <w:tc>
           <w:tcPr>
-            <w:tcW w:w="365" w:type="dxa"/>
+            <w:tcW w:w="366" w:type="dxa"/>
             <w:vMerge w:val="restart"/>
-          </w:tcPr>
-          <w:p>
-            <w:pPr>
-              <w:pStyle w:val="TableParagraph"/>
-              <w:rPr>
-                <w:rFonts w:ascii="Times New Roman"/>
+            <w:tcBorders>
+              <w:top w:val="single" w:sz="6" w:space="0" w:color="000000"/>
+              <w:start w:val="single" w:sz="6" w:space="0" w:color="000000"/>
+              <w:bottom w:val="single" w:sz="6" w:space="0" w:color="000000"/>
+              <w:end w:val="single" w:sz="6" w:space="0" w:color="000000"/>
+            </w:tcBorders>
+          </w:tcPr>
+          <w:p>
+            <w:pPr>
+              <w:pStyle w:val="TableParagraph"/>
+              <w:rPr>
+                <w:rFonts w:ascii="Times New Roman" w:hAnsi="Times New Roman"/>
                 <w:sz w:val="20"/>
               </w:rPr>
             </w:pPr>
+            <w:r>
+              <w:rPr>
+                <w:rFonts w:ascii="Times New Roman" w:hAnsi="Times New Roman"/>
+                <w:sz w:val="20"/>
+              </w:rPr>
+            </w:r>
           </w:p>
         </w:tc>
         <w:tc>
           <w:tcPr>
             <w:tcW w:w="3702" w:type="dxa"/>
-          </w:tcPr>
-          <w:p>
-            <w:pPr>
-              <w:pStyle w:val="TableParagraph"/>
-              <w:spacing w:before="230"/>
-              <w:ind w:left="107"/>
-              <w:rPr>
-                <w:rFonts w:ascii="Arial MT"/>
-                <w:sz w:val="24"/>
-              </w:rPr>
-            </w:pPr>
-            <w:r>
-              <w:rPr>
-                <w:rFonts w:ascii="Arial MT"/>
+            <w:tcBorders>
+              <w:top w:val="single" w:sz="6" w:space="0" w:color="000000"/>
+              <w:start w:val="single" w:sz="6" w:space="0" w:color="000000"/>
+              <w:bottom w:val="single" w:sz="6" w:space="0" w:color="000000"/>
+              <w:end w:val="single" w:sz="6" w:space="0" w:color="000000"/>
+            </w:tcBorders>
+          </w:tcPr>
+          <w:p>
+            <w:pPr>
+              <w:pStyle w:val="TableParagraph"/>
+              <w:spacing w:before="230" w:after="0"/>
+              <w:ind w:start="107"/>
+              <w:rPr>
+                <w:rFonts w:ascii="Arial MT" w:hAnsi="Arial MT"/>
+                <w:sz w:val="24"/>
+              </w:rPr>
+            </w:pPr>
+            <w:r>
+              <w:rPr>
+                <w:rFonts w:ascii="Arial MT" w:hAnsi="Arial MT"/>
                 <w:sz w:val="24"/>
               </w:rPr>
               <w:t>Paper</w:t>
             </w:r>
             <w:r>
               <w:rPr>
-                <w:rFonts w:ascii="Arial MT"/>
+                <w:rFonts w:ascii="Arial MT" w:hAnsi="Arial MT"/>
                 <w:spacing w:val="-3"/>
                 <w:sz w:val="24"/>
               </w:rPr>
@@ -725,7 +854,7 @@
             </w:r>
             <w:r>
               <w:rPr>
-                <w:rFonts w:ascii="Arial MT"/>
+                <w:rFonts w:ascii="Arial MT" w:hAnsi="Arial MT"/>
                 <w:spacing w:val="-10"/>
                 <w:sz w:val="24"/>
               </w:rPr>
@@ -735,20 +864,25 @@
         </w:tc>
         <w:tc>
           <w:tcPr>
-            <w:tcW w:w="1277" w:type="dxa"/>
-          </w:tcPr>
-          <w:p>
-            <w:pPr>
-              <w:pStyle w:val="TableParagraph"/>
-              <w:jc w:val="right"/>
-              <w:rPr>
-                <w:rFonts w:ascii="Times New Roman"/>
+            <w:tcW w:w="1276" w:type="dxa"/>
+            <w:tcBorders>
+              <w:top w:val="single" w:sz="6" w:space="0" w:color="000000"/>
+              <w:start w:val="single" w:sz="6" w:space="0" w:color="000000"/>
+              <w:bottom w:val="single" w:sz="6" w:space="0" w:color="000000"/>
+              <w:end w:val="single" w:sz="6" w:space="0" w:color="000000"/>
+            </w:tcBorders>
+          </w:tcPr>
+          <w:p>
+            <w:pPr>
+              <w:pStyle w:val="TableParagraph"/>
+              <w:jc w:val="end"/>
+              <w:rPr>
+                <w:rFonts w:ascii="Times New Roman" w:hAnsi="Times New Roman"/>
                 <w:sz w:val="20"/>
               </w:rPr>
             </w:pPr>
             <w:r>
               <w:rPr>
-                <w:noProof/>
                 <w:color w:val="000000"/>
                 <w:sz w:val="24"/>
                 <w:szCs w:val="24"/>
@@ -759,20 +893,25 @@
         </w:tc>
         <w:tc>
           <w:tcPr>
-            <w:tcW w:w="1280" w:type="dxa"/>
-          </w:tcPr>
-          <w:p>
-            <w:pPr>
-              <w:pStyle w:val="TableParagraph"/>
-              <w:jc w:val="right"/>
-              <w:rPr>
-                <w:rFonts w:ascii="Times New Roman"/>
+            <w:tcW w:w="1281" w:type="dxa"/>
+            <w:tcBorders>
+              <w:top w:val="single" w:sz="6" w:space="0" w:color="000000"/>
+              <w:start w:val="single" w:sz="6" w:space="0" w:color="000000"/>
+              <w:bottom w:val="single" w:sz="6" w:space="0" w:color="000000"/>
+              <w:end w:val="single" w:sz="6" w:space="0" w:color="000000"/>
+            </w:tcBorders>
+          </w:tcPr>
+          <w:p>
+            <w:pPr>
+              <w:pStyle w:val="TableParagraph"/>
+              <w:jc w:val="end"/>
+              <w:rPr>
+                <w:rFonts w:ascii="Times New Roman" w:hAnsi="Times New Roman"/>
                 <w:sz w:val="20"/>
               </w:rPr>
             </w:pPr>
             <w:r>
               <w:rPr>
-                <w:noProof/>
                 <w:color w:val="000000"/>
                 <w:sz w:val="24"/>
                 <w:szCs w:val="24"/>
@@ -784,67 +923,103 @@
         <w:tc>
           <w:tcPr>
             <w:tcW w:w="1296" w:type="dxa"/>
-            <w:shd w:val="clear" w:color="auto" w:fill="BEBEBE"/>
-          </w:tcPr>
-          <w:p>
-            <w:pPr>
-              <w:pStyle w:val="TableParagraph"/>
-              <w:rPr>
-                <w:rFonts w:ascii="Times New Roman"/>
+            <w:tcBorders>
+              <w:top w:val="single" w:sz="6" w:space="0" w:color="000000"/>
+              <w:start w:val="single" w:sz="6" w:space="0" w:color="000000"/>
+              <w:bottom w:val="single" w:sz="6" w:space="0" w:color="000000"/>
+              <w:end w:val="single" w:sz="6" w:space="0" w:color="000000"/>
+            </w:tcBorders>
+            <w:shd w:color="auto" w:fill="BEBEBE" w:val="clear"/>
+          </w:tcPr>
+          <w:p>
+            <w:pPr>
+              <w:pStyle w:val="TableParagraph"/>
+              <w:rPr>
+                <w:rFonts w:ascii="Times New Roman" w:hAnsi="Times New Roman"/>
                 <w:sz w:val="20"/>
               </w:rPr>
             </w:pPr>
+            <w:r>
+              <w:rPr>
+                <w:rFonts w:ascii="Times New Roman" w:hAnsi="Times New Roman"/>
+                <w:sz w:val="20"/>
+              </w:rPr>
+            </w:r>
           </w:p>
         </w:tc>
       </w:tr>
       <w:tr>
         <w:trPr>
-          <w:trHeight w:val="736"/>
+          <w:trHeight w:val="736" w:hRule="atLeast"/>
         </w:trPr>
         <w:tc>
           <w:tcPr>
-            <w:tcW w:w="1714" w:type="dxa"/>
-            <w:vMerge/>
-            <w:tcBorders>
-              <w:top w:val="nil"/>
-            </w:tcBorders>
-          </w:tcPr>
-          <w:p>
-            <w:pPr>
+            <w:tcW w:w="1713" w:type="dxa"/>
+            <w:vMerge w:val="continue"/>
+            <w:tcBorders>
+              <w:start w:val="single" w:sz="6" w:space="0" w:color="000000"/>
+              <w:bottom w:val="single" w:sz="6" w:space="0" w:color="000000"/>
+              <w:end w:val="single" w:sz="6" w:space="0" w:color="000000"/>
+            </w:tcBorders>
+          </w:tcPr>
+          <w:p>
+            <w:pPr>
+              <w:pStyle w:val="Normal"/>
               <w:rPr>
                 <w:sz w:val="2"/>
                 <w:szCs w:val="2"/>
               </w:rPr>
             </w:pPr>
-          </w:p>
-        </w:tc>
-        <w:tc>
-          <w:tcPr>
-            <w:tcW w:w="365" w:type="dxa"/>
-            <w:vMerge/>
-            <w:tcBorders>
-              <w:top w:val="nil"/>
-            </w:tcBorders>
-          </w:tcPr>
-          <w:p>
-            <w:pPr>
+            <w:r>
               <w:rPr>
                 <w:sz w:val="2"/>
                 <w:szCs w:val="2"/>
               </w:rPr>
-            </w:pPr>
+            </w:r>
+          </w:p>
+        </w:tc>
+        <w:tc>
+          <w:tcPr>
+            <w:tcW w:w="366" w:type="dxa"/>
+            <w:vMerge w:val="continue"/>
+            <w:tcBorders>
+              <w:start w:val="single" w:sz="6" w:space="0" w:color="000000"/>
+              <w:bottom w:val="single" w:sz="6" w:space="0" w:color="000000"/>
+              <w:end w:val="single" w:sz="6" w:space="0" w:color="000000"/>
+            </w:tcBorders>
+          </w:tcPr>
+          <w:p>
+            <w:pPr>
+              <w:pStyle w:val="Normal"/>
+              <w:rPr>
+                <w:sz w:val="2"/>
+                <w:szCs w:val="2"/>
+              </w:rPr>
+            </w:pPr>
+            <w:r>
+              <w:rPr>
+                <w:sz w:val="2"/>
+                <w:szCs w:val="2"/>
+              </w:rPr>
+            </w:r>
           </w:p>
         </w:tc>
         <w:tc>
           <w:tcPr>
             <w:tcW w:w="3702" w:type="dxa"/>
-          </w:tcPr>
-          <w:p>
-            <w:pPr>
-              <w:pStyle w:val="TableParagraph"/>
-              <w:spacing w:before="161"/>
-              <w:ind w:right="90"/>
-              <w:jc w:val="right"/>
+            <w:tcBorders>
+              <w:top w:val="single" w:sz="6" w:space="0" w:color="000000"/>
+              <w:start w:val="single" w:sz="6" w:space="0" w:color="000000"/>
+              <w:bottom w:val="single" w:sz="6" w:space="0" w:color="000000"/>
+              <w:end w:val="single" w:sz="6" w:space="0" w:color="000000"/>
+            </w:tcBorders>
+          </w:tcPr>
+          <w:p>
+            <w:pPr>
+              <w:pStyle w:val="TableParagraph"/>
+              <w:spacing w:before="161" w:after="0"/>
+              <w:ind w:end="90"/>
+              <w:jc w:val="end"/>
               <w:rPr>
                 <w:b/>
                 <w:sz w:val="24"/>
@@ -862,36 +1037,54 @@
         </w:tc>
         <w:tc>
           <w:tcPr>
-            <w:tcW w:w="1277" w:type="dxa"/>
-          </w:tcPr>
-          <w:p>
-            <w:pPr>
-              <w:pStyle w:val="TableParagraph"/>
-              <w:jc w:val="right"/>
-              <w:rPr>
-                <w:rFonts w:ascii="Times New Roman"/>
+            <w:tcW w:w="1276" w:type="dxa"/>
+            <w:tcBorders>
+              <w:top w:val="single" w:sz="6" w:space="0" w:color="000000"/>
+              <w:start w:val="single" w:sz="6" w:space="0" w:color="000000"/>
+              <w:bottom w:val="single" w:sz="6" w:space="0" w:color="000000"/>
+              <w:end w:val="single" w:sz="6" w:space="0" w:color="000000"/>
+            </w:tcBorders>
+          </w:tcPr>
+          <w:p>
+            <w:pPr>
+              <w:pStyle w:val="TableParagraph"/>
+              <w:jc w:val="end"/>
+              <w:rPr>
+                <w:rFonts w:ascii="Times New Roman" w:hAnsi="Times New Roman"/>
                 <w:sz w:val="20"/>
               </w:rPr>
             </w:pPr>
-          </w:p>
-        </w:tc>
-        <w:tc>
-          <w:tcPr>
-            <w:tcW w:w="1280" w:type="dxa"/>
-          </w:tcPr>
-          <w:p>
-            <w:pPr>
-              <w:pStyle w:val="TableParagraph"/>
-              <w:spacing w:before="230"/>
-              <w:jc w:val="right"/>
-              <w:rPr>
-                <w:rFonts w:ascii="Arial MT"/>
-                <w:sz w:val="24"/>
-              </w:rPr>
-            </w:pPr>
-            <w:r>
-              <w:rPr>
-                <w:rFonts w:ascii="Arial MT"/>
+            <w:r>
+              <w:rPr>
+                <w:rFonts w:ascii="Times New Roman" w:hAnsi="Times New Roman"/>
+                <w:sz w:val="20"/>
+              </w:rPr>
+            </w:r>
+          </w:p>
+        </w:tc>
+        <w:tc>
+          <w:tcPr>
+            <w:tcW w:w="1281" w:type="dxa"/>
+            <w:tcBorders>
+              <w:top w:val="single" w:sz="6" w:space="0" w:color="000000"/>
+              <w:start w:val="single" w:sz="6" w:space="0" w:color="000000"/>
+              <w:bottom w:val="single" w:sz="6" w:space="0" w:color="000000"/>
+              <w:end w:val="single" w:sz="6" w:space="0" w:color="000000"/>
+            </w:tcBorders>
+          </w:tcPr>
+          <w:p>
+            <w:pPr>
+              <w:pStyle w:val="TableParagraph"/>
+              <w:spacing w:before="230" w:after="0"/>
+              <w:jc w:val="end"/>
+              <w:rPr>
+                <w:rFonts w:ascii="Arial MT" w:hAnsi="Arial MT"/>
+                <w:sz w:val="24"/>
+              </w:rPr>
+            </w:pPr>
+            <w:r>
+              <w:rPr>
+                <w:rFonts w:ascii="Arial MT" w:hAnsi="Arial MT"/>
                 <w:spacing w:val="-4"/>
                 <w:sz w:val="24"/>
               </w:rPr>
@@ -899,7 +1092,6 @@
             </w:r>
             <w:r>
               <w:rPr>
-                <w:noProof/>
                 <w:color w:val="000000"/>
                 <w:sz w:val="24"/>
                 <w:szCs w:val="24"/>
@@ -908,7 +1100,7 @@
             </w:r>
             <w:r>
               <w:rPr>
-                <w:rFonts w:ascii="Arial MT"/>
+                <w:rFonts w:ascii="Arial MT" w:hAnsi="Arial MT"/>
                 <w:spacing w:val="-4"/>
                 <w:sz w:val="24"/>
               </w:rPr>
@@ -919,21 +1111,26 @@
         <w:tc>
           <w:tcPr>
             <w:tcW w:w="1296" w:type="dxa"/>
-          </w:tcPr>
-          <w:p>
-            <w:pPr>
-              <w:pStyle w:val="TableParagraph"/>
-              <w:spacing w:before="230"/>
-              <w:ind w:right="90"/>
-              <w:jc w:val="right"/>
-              <w:rPr>
-                <w:rFonts w:ascii="Arial MT"/>
-                <w:sz w:val="24"/>
-              </w:rPr>
-            </w:pPr>
-            <w:r>
-              <w:rPr>
-                <w:noProof/>
+            <w:tcBorders>
+              <w:top w:val="single" w:sz="6" w:space="0" w:color="000000"/>
+              <w:start w:val="single" w:sz="6" w:space="0" w:color="000000"/>
+              <w:bottom w:val="single" w:sz="6" w:space="0" w:color="000000"/>
+              <w:end w:val="single" w:sz="6" w:space="0" w:color="000000"/>
+            </w:tcBorders>
+          </w:tcPr>
+          <w:p>
+            <w:pPr>
+              <w:pStyle w:val="TableParagraph"/>
+              <w:spacing w:before="230" w:after="0"/>
+              <w:ind w:end="90"/>
+              <w:jc w:val="end"/>
+              <w:rPr>
+                <w:rFonts w:ascii="Arial MT" w:hAnsi="Arial MT"/>
+                <w:sz w:val="24"/>
+              </w:rPr>
+            </w:pPr>
+            <w:r>
+              <w:rPr>
                 <w:color w:val="000000"/>
                 <w:spacing w:val="1"/>
                 <w:sz w:val="24"/>
@@ -946,17 +1143,23 @@
       </w:tr>
       <w:tr>
         <w:trPr>
-          <w:trHeight w:val="738"/>
+          <w:trHeight w:val="738" w:hRule="atLeast"/>
         </w:trPr>
         <w:tc>
           <w:tcPr>
-            <w:tcW w:w="1714" w:type="dxa"/>
-          </w:tcPr>
-          <w:p>
-            <w:pPr>
-              <w:pStyle w:val="TableParagraph"/>
-              <w:spacing w:before="93"/>
-              <w:ind w:left="110" w:right="179"/>
+            <w:tcW w:w="1713" w:type="dxa"/>
+            <w:tcBorders>
+              <w:top w:val="single" w:sz="6" w:space="0" w:color="000000"/>
+              <w:start w:val="single" w:sz="6" w:space="0" w:color="000000"/>
+              <w:bottom w:val="single" w:sz="6" w:space="0" w:color="000000"/>
+              <w:end w:val="single" w:sz="6" w:space="0" w:color="000000"/>
+            </w:tcBorders>
+          </w:tcPr>
+          <w:p>
+            <w:pPr>
+              <w:pStyle w:val="TableParagraph"/>
+              <w:spacing w:before="93" w:after="0"/>
+              <w:ind w:start="110" w:end="179"/>
               <w:rPr>
                 <w:b/>
                 <w:sz w:val="24"/>
@@ -981,26 +1184,44 @@
         </w:tc>
         <w:tc>
           <w:tcPr>
-            <w:tcW w:w="365" w:type="dxa"/>
-          </w:tcPr>
-          <w:p>
-            <w:pPr>
-              <w:pStyle w:val="TableParagraph"/>
-              <w:rPr>
-                <w:rFonts w:ascii="Times New Roman"/>
+            <w:tcW w:w="366" w:type="dxa"/>
+            <w:tcBorders>
+              <w:top w:val="single" w:sz="6" w:space="0" w:color="000000"/>
+              <w:start w:val="single" w:sz="6" w:space="0" w:color="000000"/>
+              <w:bottom w:val="single" w:sz="6" w:space="0" w:color="000000"/>
+              <w:end w:val="single" w:sz="6" w:space="0" w:color="000000"/>
+            </w:tcBorders>
+          </w:tcPr>
+          <w:p>
+            <w:pPr>
+              <w:pStyle w:val="TableParagraph"/>
+              <w:rPr>
+                <w:rFonts w:ascii="Times New Roman" w:hAnsi="Times New Roman"/>
                 <w:sz w:val="20"/>
               </w:rPr>
             </w:pPr>
+            <w:r>
+              <w:rPr>
+                <w:rFonts w:ascii="Times New Roman" w:hAnsi="Times New Roman"/>
+                <w:sz w:val="20"/>
+              </w:rPr>
+            </w:r>
           </w:p>
         </w:tc>
         <w:tc>
           <w:tcPr>
             <w:tcW w:w="3702" w:type="dxa"/>
-          </w:tcPr>
-          <w:p>
-            <w:pPr>
-              <w:pStyle w:val="TableParagraph"/>
-              <w:ind w:left="36"/>
+            <w:tcBorders>
+              <w:top w:val="single" w:sz="6" w:space="0" w:color="000000"/>
+              <w:start w:val="single" w:sz="6" w:space="0" w:color="000000"/>
+              <w:bottom w:val="single" w:sz="6" w:space="0" w:color="000000"/>
+              <w:end w:val="single" w:sz="6" w:space="0" w:color="000000"/>
+            </w:tcBorders>
+          </w:tcPr>
+          <w:p>
+            <w:pPr>
+              <w:pStyle w:val="TableParagraph"/>
+              <w:ind w:start="36"/>
               <w:rPr>
                 <w:sz w:val="24"/>
                 <w:szCs w:val="24"/>
@@ -1024,20 +1245,25 @@
         </w:tc>
         <w:tc>
           <w:tcPr>
-            <w:tcW w:w="1277" w:type="dxa"/>
-          </w:tcPr>
-          <w:p>
-            <w:pPr>
-              <w:pStyle w:val="TableParagraph"/>
-              <w:jc w:val="right"/>
-              <w:rPr>
-                <w:rFonts w:ascii="Times New Roman"/>
+            <w:tcW w:w="1276" w:type="dxa"/>
+            <w:tcBorders>
+              <w:top w:val="single" w:sz="6" w:space="0" w:color="000000"/>
+              <w:start w:val="single" w:sz="6" w:space="0" w:color="000000"/>
+              <w:bottom w:val="single" w:sz="6" w:space="0" w:color="000000"/>
+              <w:end w:val="single" w:sz="6" w:space="0" w:color="000000"/>
+            </w:tcBorders>
+          </w:tcPr>
+          <w:p>
+            <w:pPr>
+              <w:pStyle w:val="TableParagraph"/>
+              <w:jc w:val="end"/>
+              <w:rPr>
+                <w:rFonts w:ascii="Times New Roman" w:hAnsi="Times New Roman"/>
                 <w:sz w:val="20"/>
               </w:rPr>
             </w:pPr>
             <w:r>
               <w:rPr>
-                <w:noProof/>
                 <w:color w:val="000000"/>
                 <w:sz w:val="24"/>
                 <w:szCs w:val="24"/>
@@ -1048,46 +1274,104 @@
         </w:tc>
         <w:tc>
           <w:tcPr>
-            <w:tcW w:w="1280" w:type="dxa"/>
-          </w:tcPr>
-          <w:p>
-            <w:pPr>
-              <w:pStyle w:val="TableParagraph"/>
-              <w:jc w:val="right"/>
-              <w:rPr>
-                <w:rFonts w:ascii="Times New Roman"/>
+            <w:tcW w:w="1281" w:type="dxa"/>
+            <w:tcBorders>
+              <w:top w:val="single" w:sz="6" w:space="0" w:color="000000"/>
+              <w:start w:val="single" w:sz="6" w:space="0" w:color="000000"/>
+              <w:bottom w:val="single" w:sz="6" w:space="0" w:color="000000"/>
+              <w:end w:val="single" w:sz="6" w:space="0" w:color="000000"/>
+            </w:tcBorders>
+          </w:tcPr>
+          <w:p>
+            <w:pPr>
+              <w:pStyle w:val="TableParagraph"/>
+              <w:jc w:val="end"/>
+              <w:rPr>
+                <w:rFonts w:ascii="Times New Roman" w:hAnsi="Times New Roman"/>
                 <w:sz w:val="20"/>
               </w:rPr>
             </w:pPr>
             <w:r>
               <w:rPr>
-                <w:noProof/>
                 <w:color w:val="000000"/>
                 <w:sz w:val="24"/>
                 <w:szCs w:val="24"/>
               </w:rPr>
-              <w:t>{t1_mark/t1total}</w:t>
+              <w:t>{t1_mark</w:t>
+            </w:r>
+            <w:r>
+              <w:rPr>
+                <w:color w:val="000000"/>
+                <w:sz w:val="24"/>
+                <w:szCs w:val="24"/>
+              </w:rPr>
+              <w:t>}</w:t>
+            </w:r>
+            <w:r>
+              <w:rPr>
+                <w:color w:val="000000"/>
+                <w:sz w:val="24"/>
+                <w:szCs w:val="24"/>
+              </w:rPr>
+              <w:t>/</w:t>
+            </w:r>
+            <w:r>
+              <w:rPr>
+                <w:color w:val="000000"/>
+                <w:sz w:val="24"/>
+                <w:szCs w:val="24"/>
+              </w:rPr>
+              <w:t>{</w:t>
+            </w:r>
+            <w:r>
+              <w:rPr>
+                <w:color w:val="000000"/>
+                <w:sz w:val="24"/>
+                <w:szCs w:val="24"/>
+              </w:rPr>
+              <w:t>t1</w:t>
+            </w:r>
+            <w:r>
+              <w:rPr>
+                <w:color w:val="000000"/>
+                <w:sz w:val="24"/>
+                <w:szCs w:val="24"/>
+              </w:rPr>
+              <w:t>_</w:t>
+            </w:r>
+            <w:r>
+              <w:rPr>
+                <w:color w:val="000000"/>
+                <w:sz w:val="24"/>
+                <w:szCs w:val="24"/>
+              </w:rPr>
+              <w:t>total}</w:t>
             </w:r>
           </w:p>
         </w:tc>
         <w:tc>
           <w:tcPr>
             <w:tcW w:w="1296" w:type="dxa"/>
-          </w:tcPr>
-          <w:p>
-            <w:pPr>
-              <w:pStyle w:val="TableParagraph"/>
-              <w:spacing w:before="230"/>
-              <w:ind w:right="90"/>
-              <w:jc w:val="right"/>
-              <w:rPr>
-                <w:rFonts w:ascii="Arial MT"/>
-                <w:sz w:val="24"/>
-              </w:rPr>
-            </w:pPr>
-            <w:r>
-              <w:rPr>
-                <w:noProof/>
+            <w:tcBorders>
+              <w:top w:val="single" w:sz="6" w:space="0" w:color="000000"/>
+              <w:start w:val="single" w:sz="6" w:space="0" w:color="000000"/>
+              <w:bottom w:val="single" w:sz="6" w:space="0" w:color="000000"/>
+              <w:end w:val="single" w:sz="6" w:space="0" w:color="000000"/>
+            </w:tcBorders>
+          </w:tcPr>
+          <w:p>
+            <w:pPr>
+              <w:pStyle w:val="TableParagraph"/>
+              <w:spacing w:before="230" w:after="0"/>
+              <w:ind w:end="90"/>
+              <w:jc w:val="end"/>
+              <w:rPr>
+                <w:rFonts w:ascii="Arial MT" w:hAnsi="Arial MT"/>
+                <w:sz w:val="24"/>
+              </w:rPr>
+            </w:pPr>
+            <w:r>
+              <w:rPr>
                 <w:color w:val="000000"/>
                 <w:spacing w:val="1"/>
                 <w:sz w:val="24"/>
@@ -1100,17 +1384,23 @@
       </w:tr>
       <w:tr>
         <w:trPr>
-          <w:trHeight w:val="736"/>
+          <w:trHeight w:val="736" w:hRule="atLeast"/>
         </w:trPr>
         <w:tc>
           <w:tcPr>
-            <w:tcW w:w="1714" w:type="dxa"/>
-          </w:tcPr>
-          <w:p>
-            <w:pPr>
-              <w:pStyle w:val="TableParagraph"/>
-              <w:spacing w:before="91"/>
-              <w:ind w:left="110" w:right="179"/>
+            <w:tcW w:w="1713" w:type="dxa"/>
+            <w:tcBorders>
+              <w:top w:val="single" w:sz="6" w:space="0" w:color="000000"/>
+              <w:start w:val="single" w:sz="6" w:space="0" w:color="000000"/>
+              <w:bottom w:val="single" w:sz="6" w:space="0" w:color="000000"/>
+              <w:end w:val="single" w:sz="6" w:space="0" w:color="000000"/>
+            </w:tcBorders>
+          </w:tcPr>
+          <w:p>
+            <w:pPr>
+              <w:pStyle w:val="TableParagraph"/>
+              <w:spacing w:before="91" w:after="0"/>
+              <w:ind w:start="110" w:end="179"/>
               <w:rPr>
                 <w:b/>
                 <w:sz w:val="24"/>
@@ -1135,26 +1425,44 @@
         </w:tc>
         <w:tc>
           <w:tcPr>
-            <w:tcW w:w="365" w:type="dxa"/>
-          </w:tcPr>
-          <w:p>
-            <w:pPr>
-              <w:pStyle w:val="TableParagraph"/>
-              <w:rPr>
-                <w:rFonts w:ascii="Times New Roman"/>
+            <w:tcW w:w="366" w:type="dxa"/>
+            <w:tcBorders>
+              <w:top w:val="single" w:sz="6" w:space="0" w:color="000000"/>
+              <w:start w:val="single" w:sz="6" w:space="0" w:color="000000"/>
+              <w:bottom w:val="single" w:sz="6" w:space="0" w:color="000000"/>
+              <w:end w:val="single" w:sz="6" w:space="0" w:color="000000"/>
+            </w:tcBorders>
+          </w:tcPr>
+          <w:p>
+            <w:pPr>
+              <w:pStyle w:val="TableParagraph"/>
+              <w:rPr>
+                <w:rFonts w:ascii="Times New Roman" w:hAnsi="Times New Roman"/>
                 <w:sz w:val="20"/>
               </w:rPr>
             </w:pPr>
+            <w:r>
+              <w:rPr>
+                <w:rFonts w:ascii="Times New Roman" w:hAnsi="Times New Roman"/>
+                <w:sz w:val="20"/>
+              </w:rPr>
+            </w:r>
           </w:p>
         </w:tc>
         <w:tc>
           <w:tcPr>
             <w:tcW w:w="3702" w:type="dxa"/>
-          </w:tcPr>
-          <w:p>
-            <w:pPr>
-              <w:pStyle w:val="TableParagraph"/>
-              <w:ind w:left="36"/>
+            <w:tcBorders>
+              <w:top w:val="single" w:sz="6" w:space="0" w:color="000000"/>
+              <w:start w:val="single" w:sz="6" w:space="0" w:color="000000"/>
+              <w:bottom w:val="single" w:sz="6" w:space="0" w:color="000000"/>
+              <w:end w:val="single" w:sz="6" w:space="0" w:color="000000"/>
+            </w:tcBorders>
+          </w:tcPr>
+          <w:p>
+            <w:pPr>
+              <w:pStyle w:val="TableParagraph"/>
+              <w:ind w:start="36"/>
               <w:rPr>
                 <w:sz w:val="24"/>
                 <w:szCs w:val="24"/>
@@ -1178,20 +1486,25 @@
         </w:tc>
         <w:tc>
           <w:tcPr>
-            <w:tcW w:w="1277" w:type="dxa"/>
-          </w:tcPr>
-          <w:p>
-            <w:pPr>
-              <w:pStyle w:val="TableParagraph"/>
-              <w:jc w:val="right"/>
-              <w:rPr>
-                <w:rFonts w:ascii="Times New Roman"/>
+            <w:tcW w:w="1276" w:type="dxa"/>
+            <w:tcBorders>
+              <w:top w:val="single" w:sz="6" w:space="0" w:color="000000"/>
+              <w:start w:val="single" w:sz="6" w:space="0" w:color="000000"/>
+              <w:bottom w:val="single" w:sz="6" w:space="0" w:color="000000"/>
+              <w:end w:val="single" w:sz="6" w:space="0" w:color="000000"/>
+            </w:tcBorders>
+          </w:tcPr>
+          <w:p>
+            <w:pPr>
+              <w:pStyle w:val="TableParagraph"/>
+              <w:jc w:val="end"/>
+              <w:rPr>
+                <w:rFonts w:ascii="Times New Roman" w:hAnsi="Times New Roman"/>
                 <w:sz w:val="20"/>
               </w:rPr>
             </w:pPr>
             <w:r>
               <w:rPr>
-                <w:noProof/>
                 <w:color w:val="000000"/>
                 <w:sz w:val="24"/>
                 <w:szCs w:val="24"/>
@@ -1202,46 +1515,88 @@
         </w:tc>
         <w:tc>
           <w:tcPr>
-            <w:tcW w:w="1280" w:type="dxa"/>
-          </w:tcPr>
-          <w:p>
-            <w:pPr>
-              <w:pStyle w:val="TableParagraph"/>
-              <w:jc w:val="right"/>
-              <w:rPr>
-                <w:rFonts w:ascii="Times New Roman"/>
+            <w:tcW w:w="1281" w:type="dxa"/>
+            <w:tcBorders>
+              <w:top w:val="single" w:sz="6" w:space="0" w:color="000000"/>
+              <w:start w:val="single" w:sz="6" w:space="0" w:color="000000"/>
+              <w:bottom w:val="single" w:sz="6" w:space="0" w:color="000000"/>
+              <w:end w:val="single" w:sz="6" w:space="0" w:color="000000"/>
+            </w:tcBorders>
+          </w:tcPr>
+          <w:p>
+            <w:pPr>
+              <w:pStyle w:val="TableParagraph"/>
+              <w:jc w:val="end"/>
+              <w:rPr>
+                <w:rFonts w:ascii="Times New Roman" w:hAnsi="Times New Roman"/>
                 <w:sz w:val="20"/>
               </w:rPr>
             </w:pPr>
             <w:r>
               <w:rPr>
-                <w:noProof/>
                 <w:color w:val="000000"/>
                 <w:sz w:val="24"/>
                 <w:szCs w:val="24"/>
               </w:rPr>
-              <w:t>{t2_mark/t2_total}</w:t>
+              <w:t>{t2_mark</w:t>
+            </w:r>
+            <w:r>
+              <w:rPr>
+                <w:color w:val="000000"/>
+                <w:sz w:val="24"/>
+                <w:szCs w:val="24"/>
+              </w:rPr>
+              <w:t>}</w:t>
+            </w:r>
+            <w:r>
+              <w:rPr>
+                <w:color w:val="000000"/>
+                <w:sz w:val="24"/>
+                <w:szCs w:val="24"/>
+              </w:rPr>
+              <w:t>/</w:t>
+            </w:r>
+            <w:r>
+              <w:rPr>
+                <w:color w:val="000000"/>
+                <w:sz w:val="24"/>
+                <w:szCs w:val="24"/>
+              </w:rPr>
+              <w:t>{</w:t>
+            </w:r>
+            <w:r>
+              <w:rPr>
+                <w:color w:val="000000"/>
+                <w:sz w:val="24"/>
+                <w:szCs w:val="24"/>
+              </w:rPr>
+              <w:t>t2_total}</w:t>
             </w:r>
           </w:p>
         </w:tc>
         <w:tc>
           <w:tcPr>
             <w:tcW w:w="1296" w:type="dxa"/>
-          </w:tcPr>
-          <w:p>
-            <w:pPr>
-              <w:pStyle w:val="TableParagraph"/>
-              <w:spacing w:before="230"/>
-              <w:ind w:right="90"/>
-              <w:jc w:val="right"/>
-              <w:rPr>
-                <w:rFonts w:ascii="Arial MT"/>
-                <w:sz w:val="24"/>
-              </w:rPr>
-            </w:pPr>
-            <w:r>
-              <w:rPr>
-                <w:noProof/>
+            <w:tcBorders>
+              <w:top w:val="single" w:sz="6" w:space="0" w:color="000000"/>
+              <w:start w:val="single" w:sz="6" w:space="0" w:color="000000"/>
+              <w:bottom w:val="single" w:sz="6" w:space="0" w:color="000000"/>
+              <w:end w:val="single" w:sz="6" w:space="0" w:color="000000"/>
+            </w:tcBorders>
+          </w:tcPr>
+          <w:p>
+            <w:pPr>
+              <w:pStyle w:val="TableParagraph"/>
+              <w:spacing w:before="230" w:after="0"/>
+              <w:ind w:end="90"/>
+              <w:jc w:val="end"/>
+              <w:rPr>
+                <w:rFonts w:ascii="Arial MT" w:hAnsi="Arial MT"/>
+                <w:sz w:val="24"/>
+              </w:rPr>
+            </w:pPr>
+            <w:r>
+              <w:rPr>
                 <w:color w:val="000000"/>
                 <w:spacing w:val="1"/>
                 <w:sz w:val="24"/>
@@ -1254,17 +1609,23 @@
       </w:tr>
       <w:tr>
         <w:trPr>
-          <w:trHeight w:val="827"/>
+          <w:trHeight w:val="827" w:hRule="atLeast"/>
         </w:trPr>
         <w:tc>
           <w:tcPr>
-            <w:tcW w:w="1714" w:type="dxa"/>
-          </w:tcPr>
-          <w:p>
-            <w:pPr>
-              <w:pStyle w:val="TableParagraph"/>
-              <w:spacing w:line="270" w:lineRule="atLeast"/>
-              <w:ind w:left="110" w:right="179"/>
+            <w:tcW w:w="1713" w:type="dxa"/>
+            <w:tcBorders>
+              <w:top w:val="single" w:sz="6" w:space="0" w:color="000000"/>
+              <w:start w:val="single" w:sz="6" w:space="0" w:color="000000"/>
+              <w:bottom w:val="single" w:sz="6" w:space="0" w:color="000000"/>
+              <w:end w:val="single" w:sz="6" w:space="0" w:color="000000"/>
+            </w:tcBorders>
+          </w:tcPr>
+          <w:p>
+            <w:pPr>
+              <w:pStyle w:val="TableParagraph"/>
+              <w:spacing w:lineRule="atLeast" w:line="270"/>
+              <w:ind w:start="110" w:end="179"/>
               <w:rPr>
                 <w:b/>
                 <w:sz w:val="24"/>
@@ -1282,26 +1643,44 @@
         </w:tc>
         <w:tc>
           <w:tcPr>
-            <w:tcW w:w="365" w:type="dxa"/>
-          </w:tcPr>
-          <w:p>
-            <w:pPr>
-              <w:pStyle w:val="TableParagraph"/>
-              <w:rPr>
-                <w:rFonts w:ascii="Times New Roman"/>
+            <w:tcW w:w="366" w:type="dxa"/>
+            <w:tcBorders>
+              <w:top w:val="single" w:sz="6" w:space="0" w:color="000000"/>
+              <w:start w:val="single" w:sz="6" w:space="0" w:color="000000"/>
+              <w:bottom w:val="single" w:sz="6" w:space="0" w:color="000000"/>
+              <w:end w:val="single" w:sz="6" w:space="0" w:color="000000"/>
+            </w:tcBorders>
+          </w:tcPr>
+          <w:p>
+            <w:pPr>
+              <w:pStyle w:val="TableParagraph"/>
+              <w:rPr>
+                <w:rFonts w:ascii="Times New Roman" w:hAnsi="Times New Roman"/>
                 <w:sz w:val="20"/>
               </w:rPr>
             </w:pPr>
+            <w:r>
+              <w:rPr>
+                <w:rFonts w:ascii="Times New Roman" w:hAnsi="Times New Roman"/>
+                <w:sz w:val="20"/>
+              </w:rPr>
+            </w:r>
           </w:p>
         </w:tc>
         <w:tc>
           <w:tcPr>
             <w:tcW w:w="3702" w:type="dxa"/>
-          </w:tcPr>
-          <w:p>
-            <w:pPr>
-              <w:pStyle w:val="TableParagraph"/>
-              <w:ind w:left="36"/>
+            <w:tcBorders>
+              <w:top w:val="single" w:sz="6" w:space="0" w:color="000000"/>
+              <w:start w:val="single" w:sz="6" w:space="0" w:color="000000"/>
+              <w:bottom w:val="single" w:sz="6" w:space="0" w:color="000000"/>
+              <w:end w:val="single" w:sz="6" w:space="0" w:color="000000"/>
+            </w:tcBorders>
+          </w:tcPr>
+          <w:p>
+            <w:pPr>
+              <w:pStyle w:val="TableParagraph"/>
+              <w:ind w:start="36"/>
               <w:rPr>
                 <w:sz w:val="24"/>
                 <w:szCs w:val="24"/>
@@ -1325,14 +1704,20 @@
         </w:tc>
         <w:tc>
           <w:tcPr>
-            <w:tcW w:w="1277" w:type="dxa"/>
-          </w:tcPr>
-          <w:p>
-            <w:pPr>
-              <w:pStyle w:val="TableParagraph"/>
-              <w:jc w:val="right"/>
-              <w:rPr>
-                <w:rFonts w:ascii="Times New Roman"/>
+            <w:tcW w:w="1276" w:type="dxa"/>
+            <w:tcBorders>
+              <w:top w:val="single" w:sz="6" w:space="0" w:color="000000"/>
+              <w:start w:val="single" w:sz="6" w:space="0" w:color="000000"/>
+              <w:bottom w:val="single" w:sz="6" w:space="0" w:color="000000"/>
+              <w:end w:val="single" w:sz="6" w:space="0" w:color="000000"/>
+            </w:tcBorders>
+          </w:tcPr>
+          <w:p>
+            <w:pPr>
+              <w:pStyle w:val="TableParagraph"/>
+              <w:jc w:val="end"/>
+              <w:rPr>
+                <w:rFonts w:ascii="Times New Roman" w:hAnsi="Times New Roman"/>
                 <w:sz w:val="20"/>
               </w:rPr>
             </w:pPr>
@@ -1348,20 +1733,33 @@
                 <w:sz w:val="24"/>
                 <w:szCs w:val="24"/>
               </w:rPr>
-              <w:t>wp_date}</w:t>
-            </w:r>
-          </w:p>
-        </w:tc>
-        <w:tc>
-          <w:tcPr>
-            <w:tcW w:w="1280" w:type="dxa"/>
-          </w:tcPr>
-          <w:p>
-            <w:pPr>
-              <w:pStyle w:val="TableParagraph"/>
-              <w:jc w:val="right"/>
-              <w:rPr>
-                <w:rFonts w:ascii="Times New Roman"/>
+              <w:t>wp_date</w:t>
+            </w:r>
+            <w:r>
+              <w:rPr>
+                <w:sz w:val="24"/>
+                <w:szCs w:val="24"/>
+              </w:rPr>
+              <w:t>}</w:t>
+            </w:r>
+          </w:p>
+        </w:tc>
+        <w:tc>
+          <w:tcPr>
+            <w:tcW w:w="1281" w:type="dxa"/>
+            <w:tcBorders>
+              <w:top w:val="single" w:sz="6" w:space="0" w:color="000000"/>
+              <w:start w:val="single" w:sz="6" w:space="0" w:color="000000"/>
+              <w:bottom w:val="single" w:sz="6" w:space="0" w:color="000000"/>
+              <w:end w:val="single" w:sz="6" w:space="0" w:color="000000"/>
+            </w:tcBorders>
+          </w:tcPr>
+          <w:p>
+            <w:pPr>
+              <w:pStyle w:val="TableParagraph"/>
+              <w:jc w:val="end"/>
+              <w:rPr>
+                <w:rFonts w:ascii="Times New Roman" w:hAnsi="Times New Roman"/>
                 <w:sz w:val="20"/>
               </w:rPr>
             </w:pPr>
@@ -1377,8 +1775,51 @@
                 <w:sz w:val="24"/>
                 <w:szCs w:val="24"/>
               </w:rPr>
-              <w:t>wp_mark}/</w:t>
-            </w:r>
+              <w:t>wp_mark</w:t>
+            </w:r>
+            <w:r>
+              <w:rPr>
+                <w:sz w:val="24"/>
+                <w:szCs w:val="24"/>
+              </w:rPr>
+              <w:t>}/{</w:t>
+            </w:r>
+            <w:r>
+              <w:rPr>
+                <w:sz w:val="24"/>
+                <w:szCs w:val="24"/>
+              </w:rPr>
+              <w:t>wp_total</w:t>
+            </w:r>
+            <w:r>
+              <w:rPr>
+                <w:sz w:val="24"/>
+                <w:szCs w:val="24"/>
+              </w:rPr>
+              <w:t>}</w:t>
+            </w:r>
+          </w:p>
+        </w:tc>
+        <w:tc>
+          <w:tcPr>
+            <w:tcW w:w="1296" w:type="dxa"/>
+            <w:tcBorders>
+              <w:top w:val="single" w:sz="6" w:space="0" w:color="000000"/>
+              <w:start w:val="single" w:sz="6" w:space="0" w:color="000000"/>
+              <w:bottom w:val="single" w:sz="6" w:space="0" w:color="000000"/>
+              <w:end w:val="single" w:sz="6" w:space="0" w:color="000000"/>
+            </w:tcBorders>
+          </w:tcPr>
+          <w:p>
+            <w:pPr>
+              <w:pStyle w:val="TableParagraph"/>
+              <w:ind w:end="90"/>
+              <w:jc w:val="end"/>
+              <w:rPr>
+                <w:rFonts w:ascii="Arial MT" w:hAnsi="Arial MT"/>
+                <w:sz w:val="24"/>
+              </w:rPr>
+            </w:pPr>
             <w:r>
               <w:rPr>
                 <w:sz w:val="24"/>
@@ -1391,37 +1832,14 @@
                 <w:sz w:val="24"/>
                 <w:szCs w:val="24"/>
               </w:rPr>
-              <w:t>wp_total}</w:t>
-            </w:r>
-          </w:p>
-        </w:tc>
-        <w:tc>
-          <w:tcPr>
-            <w:tcW w:w="1296" w:type="dxa"/>
-          </w:tcPr>
-          <w:p>
-            <w:pPr>
-              <w:pStyle w:val="TableParagraph"/>
-              <w:ind w:right="90"/>
-              <w:jc w:val="right"/>
-              <w:rPr>
-                <w:rFonts w:ascii="Arial MT"/>
-                <w:sz w:val="24"/>
-              </w:rPr>
-            </w:pPr>
-            <w:r>
-              <w:rPr>
-                <w:sz w:val="24"/>
-                <w:szCs w:val="24"/>
-              </w:rPr>
-              <w:t>{</w:t>
-            </w:r>
-            <w:r>
-              <w:rPr>
-                <w:sz w:val="24"/>
-                <w:szCs w:val="24"/>
-              </w:rPr>
-              <w:t>wp_weight}</w:t>
+              <w:t>wp_weight</w:t>
+            </w:r>
+            <w:r>
+              <w:rPr>
+                <w:sz w:val="24"/>
+                <w:szCs w:val="24"/>
+              </w:rPr>
+              <w:t>}</w:t>
             </w:r>
             <w:r>
               <w:rPr>
@@ -1437,17 +1855,23 @@
       </w:tr>
       <w:tr>
         <w:trPr>
-          <w:trHeight w:val="736"/>
+          <w:trHeight w:val="736" w:hRule="atLeast"/>
         </w:trPr>
         <w:tc>
           <w:tcPr>
-            <w:tcW w:w="1714" w:type="dxa"/>
-          </w:tcPr>
-          <w:p>
-            <w:pPr>
-              <w:pStyle w:val="TableParagraph"/>
-              <w:spacing w:before="230"/>
-              <w:ind w:left="110"/>
+            <w:tcW w:w="1713" w:type="dxa"/>
+            <w:tcBorders>
+              <w:top w:val="single" w:sz="6" w:space="0" w:color="000000"/>
+              <w:start w:val="single" w:sz="6" w:space="0" w:color="000000"/>
+              <w:bottom w:val="single" w:sz="6" w:space="0" w:color="000000"/>
+              <w:end w:val="single" w:sz="6" w:space="0" w:color="000000"/>
+            </w:tcBorders>
+          </w:tcPr>
+          <w:p>
+            <w:pPr>
+              <w:pStyle w:val="TableParagraph"/>
+              <w:spacing w:before="230" w:after="0"/>
+              <w:ind w:start="110"/>
               <w:rPr>
                 <w:b/>
                 <w:sz w:val="24"/>
@@ -1480,26 +1904,44 @@
         </w:tc>
         <w:tc>
           <w:tcPr>
-            <w:tcW w:w="365" w:type="dxa"/>
-          </w:tcPr>
-          <w:p>
-            <w:pPr>
-              <w:pStyle w:val="TableParagraph"/>
-              <w:rPr>
-                <w:rFonts w:ascii="Times New Roman"/>
+            <w:tcW w:w="366" w:type="dxa"/>
+            <w:tcBorders>
+              <w:top w:val="single" w:sz="6" w:space="0" w:color="000000"/>
+              <w:start w:val="single" w:sz="6" w:space="0" w:color="000000"/>
+              <w:bottom w:val="single" w:sz="6" w:space="0" w:color="000000"/>
+              <w:end w:val="single" w:sz="6" w:space="0" w:color="000000"/>
+            </w:tcBorders>
+          </w:tcPr>
+          <w:p>
+            <w:pPr>
+              <w:pStyle w:val="TableParagraph"/>
+              <w:rPr>
+                <w:rFonts w:ascii="Times New Roman" w:hAnsi="Times New Roman"/>
                 <w:sz w:val="20"/>
               </w:rPr>
             </w:pPr>
+            <w:r>
+              <w:rPr>
+                <w:rFonts w:ascii="Times New Roman" w:hAnsi="Times New Roman"/>
+                <w:sz w:val="20"/>
+              </w:rPr>
+            </w:r>
           </w:p>
         </w:tc>
         <w:tc>
           <w:tcPr>
             <w:tcW w:w="3702" w:type="dxa"/>
-          </w:tcPr>
-          <w:p>
-            <w:pPr>
-              <w:pStyle w:val="TableParagraph"/>
-              <w:ind w:left="36"/>
+            <w:tcBorders>
+              <w:top w:val="single" w:sz="6" w:space="0" w:color="000000"/>
+              <w:start w:val="single" w:sz="6" w:space="0" w:color="000000"/>
+              <w:bottom w:val="single" w:sz="6" w:space="0" w:color="000000"/>
+              <w:end w:val="single" w:sz="6" w:space="0" w:color="000000"/>
+            </w:tcBorders>
+          </w:tcPr>
+          <w:p>
+            <w:pPr>
+              <w:pStyle w:val="TableParagraph"/>
+              <w:ind w:start="36"/>
               <w:rPr>
                 <w:sz w:val="24"/>
                 <w:szCs w:val="24"/>
@@ -1523,20 +1965,25 @@
         </w:tc>
         <w:tc>
           <w:tcPr>
-            <w:tcW w:w="1277" w:type="dxa"/>
-          </w:tcPr>
-          <w:p>
-            <w:pPr>
-              <w:pStyle w:val="TableParagraph"/>
-              <w:jc w:val="right"/>
-              <w:rPr>
-                <w:rFonts w:ascii="Times New Roman"/>
+            <w:tcW w:w="1276" w:type="dxa"/>
+            <w:tcBorders>
+              <w:top w:val="single" w:sz="6" w:space="0" w:color="000000"/>
+              <w:start w:val="single" w:sz="6" w:space="0" w:color="000000"/>
+              <w:bottom w:val="single" w:sz="6" w:space="0" w:color="000000"/>
+              <w:end w:val="single" w:sz="6" w:space="0" w:color="000000"/>
+            </w:tcBorders>
+          </w:tcPr>
+          <w:p>
+            <w:pPr>
+              <w:pStyle w:val="TableParagraph"/>
+              <w:jc w:val="end"/>
+              <w:rPr>
+                <w:rFonts w:ascii="Times New Roman" w:hAnsi="Times New Roman"/>
                 <w:sz w:val="20"/>
               </w:rPr>
             </w:pPr>
             <w:r>
               <w:rPr>
-                <w:noProof/>
                 <w:color w:val="000000"/>
                 <w:sz w:val="24"/>
                 <w:szCs w:val="24"/>
@@ -1547,20 +1994,25 @@
         </w:tc>
         <w:tc>
           <w:tcPr>
-            <w:tcW w:w="1280" w:type="dxa"/>
-          </w:tcPr>
-          <w:p>
-            <w:pPr>
-              <w:pStyle w:val="TableParagraph"/>
-              <w:jc w:val="right"/>
-              <w:rPr>
-                <w:rFonts w:ascii="Times New Roman"/>
+            <w:tcW w:w="1281" w:type="dxa"/>
+            <w:tcBorders>
+              <w:top w:val="single" w:sz="6" w:space="0" w:color="000000"/>
+              <w:start w:val="single" w:sz="6" w:space="0" w:color="000000"/>
+              <w:bottom w:val="single" w:sz="6" w:space="0" w:color="000000"/>
+              <w:end w:val="single" w:sz="6" w:space="0" w:color="000000"/>
+            </w:tcBorders>
+          </w:tcPr>
+          <w:p>
+            <w:pPr>
+              <w:pStyle w:val="TableParagraph"/>
+              <w:jc w:val="end"/>
+              <w:rPr>
+                <w:rFonts w:ascii="Times New Roman" w:hAnsi="Times New Roman"/>
                 <w:sz w:val="20"/>
               </w:rPr>
             </w:pPr>
             <w:r>
               <w:rPr>
-                <w:noProof/>
                 <w:color w:val="000000"/>
                 <w:sz w:val="24"/>
                 <w:szCs w:val="24"/>
@@ -1572,21 +2024,26 @@
         <w:tc>
           <w:tcPr>
             <w:tcW w:w="1296" w:type="dxa"/>
-          </w:tcPr>
-          <w:p>
-            <w:pPr>
-              <w:pStyle w:val="TableParagraph"/>
-              <w:spacing w:before="230"/>
-              <w:ind w:right="89"/>
-              <w:jc w:val="right"/>
-              <w:rPr>
-                <w:rFonts w:ascii="Arial MT"/>
-                <w:sz w:val="24"/>
-              </w:rPr>
-            </w:pPr>
-            <w:r>
-              <w:rPr>
-                <w:noProof/>
+            <w:tcBorders>
+              <w:top w:val="single" w:sz="6" w:space="0" w:color="000000"/>
+              <w:start w:val="single" w:sz="6" w:space="0" w:color="000000"/>
+              <w:bottom w:val="single" w:sz="6" w:space="0" w:color="000000"/>
+              <w:end w:val="single" w:sz="6" w:space="0" w:color="000000"/>
+            </w:tcBorders>
+          </w:tcPr>
+          <w:p>
+            <w:pPr>
+              <w:pStyle w:val="TableParagraph"/>
+              <w:spacing w:before="230" w:after="0"/>
+              <w:ind w:end="89"/>
+              <w:jc w:val="end"/>
+              <w:rPr>
+                <w:rFonts w:ascii="Arial MT" w:hAnsi="Arial MT"/>
+                <w:sz w:val="24"/>
+              </w:rPr>
+            </w:pPr>
+            <w:r>
+              <w:rPr>
                 <w:color w:val="000000"/>
                 <w:sz w:val="24"/>
                 <w:szCs w:val="24"/>
@@ -1595,7 +2052,6 @@
             </w:r>
             <w:r>
               <w:rPr>
-                <w:noProof/>
                 <w:color w:val="000000"/>
                 <w:spacing w:val="1"/>
                 <w:sz w:val="24"/>
@@ -1608,17 +2064,23 @@
       </w:tr>
       <w:tr>
         <w:trPr>
-          <w:trHeight w:val="738"/>
+          <w:trHeight w:val="738" w:hRule="atLeast"/>
         </w:trPr>
         <w:tc>
           <w:tcPr>
-            <w:tcW w:w="1714" w:type="dxa"/>
-          </w:tcPr>
-          <w:p>
-            <w:pPr>
-              <w:pStyle w:val="TableParagraph"/>
-              <w:spacing w:before="233"/>
-              <w:ind w:left="110"/>
+            <w:tcW w:w="1713" w:type="dxa"/>
+            <w:tcBorders>
+              <w:top w:val="single" w:sz="6" w:space="0" w:color="000000"/>
+              <w:start w:val="single" w:sz="6" w:space="0" w:color="000000"/>
+              <w:bottom w:val="single" w:sz="6" w:space="0" w:color="000000"/>
+              <w:end w:val="single" w:sz="6" w:space="0" w:color="000000"/>
+            </w:tcBorders>
+          </w:tcPr>
+          <w:p>
+            <w:pPr>
+              <w:pStyle w:val="TableParagraph"/>
+              <w:spacing w:before="233" w:after="0"/>
+              <w:ind w:start="110"/>
               <w:rPr>
                 <w:b/>
                 <w:sz w:val="24"/>
@@ -1651,26 +2113,44 @@
         </w:tc>
         <w:tc>
           <w:tcPr>
-            <w:tcW w:w="365" w:type="dxa"/>
-          </w:tcPr>
-          <w:p>
-            <w:pPr>
-              <w:pStyle w:val="TableParagraph"/>
-              <w:rPr>
-                <w:rFonts w:ascii="Times New Roman"/>
+            <w:tcW w:w="366" w:type="dxa"/>
+            <w:tcBorders>
+              <w:top w:val="single" w:sz="6" w:space="0" w:color="000000"/>
+              <w:start w:val="single" w:sz="6" w:space="0" w:color="000000"/>
+              <w:bottom w:val="single" w:sz="6" w:space="0" w:color="000000"/>
+              <w:end w:val="single" w:sz="6" w:space="0" w:color="000000"/>
+            </w:tcBorders>
+          </w:tcPr>
+          <w:p>
+            <w:pPr>
+              <w:pStyle w:val="TableParagraph"/>
+              <w:rPr>
+                <w:rFonts w:ascii="Times New Roman" w:hAnsi="Times New Roman"/>
                 <w:sz w:val="20"/>
               </w:rPr>
             </w:pPr>
+            <w:r>
+              <w:rPr>
+                <w:rFonts w:ascii="Times New Roman" w:hAnsi="Times New Roman"/>
+                <w:sz w:val="20"/>
+              </w:rPr>
+            </w:r>
           </w:p>
         </w:tc>
         <w:tc>
           <w:tcPr>
             <w:tcW w:w="3702" w:type="dxa"/>
-          </w:tcPr>
-          <w:p>
-            <w:pPr>
-              <w:pStyle w:val="TableParagraph"/>
-              <w:ind w:left="36"/>
+            <w:tcBorders>
+              <w:top w:val="single" w:sz="6" w:space="0" w:color="000000"/>
+              <w:start w:val="single" w:sz="6" w:space="0" w:color="000000"/>
+              <w:bottom w:val="single" w:sz="6" w:space="0" w:color="000000"/>
+              <w:end w:val="single" w:sz="6" w:space="0" w:color="000000"/>
+            </w:tcBorders>
+          </w:tcPr>
+          <w:p>
+            <w:pPr>
+              <w:pStyle w:val="TableParagraph"/>
+              <w:ind w:start="36"/>
               <w:rPr>
                 <w:sz w:val="24"/>
                 <w:szCs w:val="24"/>
@@ -1694,20 +2174,25 @@
         </w:tc>
         <w:tc>
           <w:tcPr>
-            <w:tcW w:w="1277" w:type="dxa"/>
-          </w:tcPr>
-          <w:p>
-            <w:pPr>
-              <w:pStyle w:val="TableParagraph"/>
-              <w:jc w:val="right"/>
-              <w:rPr>
-                <w:rFonts w:ascii="Times New Roman"/>
+            <w:tcW w:w="1276" w:type="dxa"/>
+            <w:tcBorders>
+              <w:top w:val="single" w:sz="6" w:space="0" w:color="000000"/>
+              <w:start w:val="single" w:sz="6" w:space="0" w:color="000000"/>
+              <w:bottom w:val="single" w:sz="6" w:space="0" w:color="000000"/>
+              <w:end w:val="single" w:sz="6" w:space="0" w:color="000000"/>
+            </w:tcBorders>
+          </w:tcPr>
+          <w:p>
+            <w:pPr>
+              <w:pStyle w:val="TableParagraph"/>
+              <w:jc w:val="end"/>
+              <w:rPr>
+                <w:rFonts w:ascii="Times New Roman" w:hAnsi="Times New Roman"/>
                 <w:sz w:val="20"/>
               </w:rPr>
             </w:pPr>
             <w:r>
               <w:rPr>
-                <w:noProof/>
                 <w:color w:val="000000"/>
                 <w:sz w:val="24"/>
                 <w:szCs w:val="24"/>
@@ -1718,20 +2203,25 @@
         </w:tc>
         <w:tc>
           <w:tcPr>
-            <w:tcW w:w="1280" w:type="dxa"/>
-          </w:tcPr>
-          <w:p>
-            <w:pPr>
-              <w:pStyle w:val="TableParagraph"/>
-              <w:jc w:val="right"/>
-              <w:rPr>
-                <w:rFonts w:ascii="Times New Roman"/>
+            <w:tcW w:w="1281" w:type="dxa"/>
+            <w:tcBorders>
+              <w:top w:val="single" w:sz="6" w:space="0" w:color="000000"/>
+              <w:start w:val="single" w:sz="6" w:space="0" w:color="000000"/>
+              <w:bottom w:val="single" w:sz="6" w:space="0" w:color="000000"/>
+              <w:end w:val="single" w:sz="6" w:space="0" w:color="000000"/>
+            </w:tcBorders>
+          </w:tcPr>
+          <w:p>
+            <w:pPr>
+              <w:pStyle w:val="TableParagraph"/>
+              <w:jc w:val="end"/>
+              <w:rPr>
+                <w:rFonts w:ascii="Times New Roman" w:hAnsi="Times New Roman"/>
                 <w:sz w:val="20"/>
               </w:rPr>
             </w:pPr>
             <w:r>
               <w:rPr>
-                <w:noProof/>
                 <w:color w:val="000000"/>
                 <w:sz w:val="24"/>
                 <w:szCs w:val="24"/>
@@ -1743,21 +2233,26 @@
         <w:tc>
           <w:tcPr>
             <w:tcW w:w="1296" w:type="dxa"/>
-          </w:tcPr>
-          <w:p>
-            <w:pPr>
-              <w:pStyle w:val="TableParagraph"/>
-              <w:spacing w:before="233"/>
-              <w:ind w:right="89"/>
-              <w:jc w:val="right"/>
-              <w:rPr>
-                <w:rFonts w:ascii="Arial MT"/>
-                <w:sz w:val="24"/>
-              </w:rPr>
-            </w:pPr>
-            <w:r>
-              <w:rPr>
-                <w:noProof/>
+            <w:tcBorders>
+              <w:top w:val="single" w:sz="6" w:space="0" w:color="000000"/>
+              <w:start w:val="single" w:sz="6" w:space="0" w:color="000000"/>
+              <w:bottom w:val="single" w:sz="6" w:space="0" w:color="000000"/>
+              <w:end w:val="single" w:sz="6" w:space="0" w:color="000000"/>
+            </w:tcBorders>
+          </w:tcPr>
+          <w:p>
+            <w:pPr>
+              <w:pStyle w:val="TableParagraph"/>
+              <w:spacing w:before="233" w:after="0"/>
+              <w:ind w:end="89"/>
+              <w:jc w:val="end"/>
+              <w:rPr>
+                <w:rFonts w:ascii="Arial MT" w:hAnsi="Arial MT"/>
+                <w:sz w:val="24"/>
+              </w:rPr>
+            </w:pPr>
+            <w:r>
+              <w:rPr>
                 <w:color w:val="000000"/>
                 <w:sz w:val="24"/>
                 <w:szCs w:val="24"/>
@@ -1766,7 +2261,6 @@
             </w:r>
             <w:r>
               <w:rPr>
-                <w:noProof/>
                 <w:color w:val="000000"/>
                 <w:spacing w:val="1"/>
                 <w:sz w:val="24"/>
@@ -1779,35 +2273,47 @@
       </w:tr>
       <w:tr>
         <w:trPr>
-          <w:trHeight w:val="827"/>
+          <w:trHeight w:val="827" w:hRule="atLeast"/>
         </w:trPr>
         <w:tc>
           <w:tcPr>
-            <w:tcW w:w="7058" w:type="dxa"/>
+            <w:tcW w:w="7057" w:type="dxa"/>
             <w:gridSpan w:val="4"/>
             <w:tcBorders>
-              <w:left w:val="nil"/>
-              <w:bottom w:val="nil"/>
-            </w:tcBorders>
-          </w:tcPr>
-          <w:p>
-            <w:pPr>
-              <w:pStyle w:val="TableParagraph"/>
-              <w:rPr>
-                <w:rFonts w:ascii="Times New Roman"/>
+              <w:top w:val="single" w:sz="6" w:space="0" w:color="000000"/>
+              <w:end w:val="single" w:sz="6" w:space="0" w:color="000000"/>
+            </w:tcBorders>
+          </w:tcPr>
+          <w:p>
+            <w:pPr>
+              <w:pStyle w:val="TableParagraph"/>
+              <w:rPr>
+                <w:rFonts w:ascii="Times New Roman" w:hAnsi="Times New Roman"/>
                 <w:sz w:val="20"/>
               </w:rPr>
             </w:pPr>
-          </w:p>
-        </w:tc>
-        <w:tc>
-          <w:tcPr>
-            <w:tcW w:w="1280" w:type="dxa"/>
-          </w:tcPr>
-          <w:p>
-            <w:pPr>
-              <w:pStyle w:val="TableParagraph"/>
-              <w:ind w:left="143" w:right="124"/>
+            <w:r>
+              <w:rPr>
+                <w:rFonts w:ascii="Times New Roman" w:hAnsi="Times New Roman"/>
+                <w:sz w:val="20"/>
+              </w:rPr>
+            </w:r>
+          </w:p>
+        </w:tc>
+        <w:tc>
+          <w:tcPr>
+            <w:tcW w:w="1281" w:type="dxa"/>
+            <w:tcBorders>
+              <w:top w:val="single" w:sz="6" w:space="0" w:color="000000"/>
+              <w:start w:val="single" w:sz="6" w:space="0" w:color="000000"/>
+              <w:bottom w:val="single" w:sz="6" w:space="0" w:color="000000"/>
+              <w:end w:val="single" w:sz="6" w:space="0" w:color="000000"/>
+            </w:tcBorders>
+          </w:tcPr>
+          <w:p>
+            <w:pPr>
+              <w:pStyle w:val="TableParagraph"/>
+              <w:ind w:start="143" w:end="124"/>
               <w:jc w:val="center"/>
               <w:rPr>
                 <w:b/>
@@ -1826,8 +2332,8 @@
           <w:p>
             <w:pPr>
               <w:pStyle w:val="TableParagraph"/>
-              <w:spacing w:line="270" w:lineRule="atLeast"/>
-              <w:ind w:left="143" w:right="124"/>
+              <w:spacing w:lineRule="atLeast" w:line="270"/>
+              <w:ind w:start="143" w:end="124"/>
               <w:jc w:val="center"/>
               <w:rPr>
                 <w:b/>
@@ -1869,11 +2375,17 @@
         <w:tc>
           <w:tcPr>
             <w:tcW w:w="1296" w:type="dxa"/>
-          </w:tcPr>
-          <w:p>
-            <w:pPr>
-              <w:pStyle w:val="TableParagraph"/>
-              <w:jc w:val="right"/>
+            <w:tcBorders>
+              <w:top w:val="single" w:sz="6" w:space="0" w:color="000000"/>
+              <w:start w:val="single" w:sz="6" w:space="0" w:color="000000"/>
+              <w:bottom w:val="single" w:sz="6" w:space="0" w:color="000000"/>
+              <w:end w:val="single" w:sz="6" w:space="0" w:color="000000"/>
+            </w:tcBorders>
+          </w:tcPr>
+          <w:p>
+            <w:pPr>
+              <w:pStyle w:val="TableParagraph"/>
+              <w:jc w:val="end"/>
               <w:rPr>
                 <w:b/>
                 <w:bCs/>
@@ -1894,88 +2406,100 @@
         </w:tc>
       </w:tr>
     </w:tbl>
-    <w:p/>
+    <w:p>
+      <w:pPr>
+        <w:pStyle w:val="Normal"/>
+        <w:rPr/>
+      </w:pPr>
+      <w:r>
+        <w:rPr/>
+      </w:r>
+    </w:p>
     <w:sectPr>
-      <w:footerReference w:type="default" r:id="rId7"/>
-      <w:type w:val="continuous"/>
-      <w:pgSz w:w="11910" w:h="16840"/>
-      <w:pgMar w:top="760" w:right="992" w:bottom="820" w:left="992" w:header="0" w:footer="636" w:gutter="0"/>
-      <w:pgNumType w:start="1"/>
-      <w:cols w:space="720"/>
+      <w:footerReference w:type="even" r:id="rId3"/>
+      <w:footerReference w:type="default" r:id="rId4"/>
+      <w:footerReference w:type="first" r:id="rId5"/>
+      <w:type w:val="nextPage"/>
+      <w:pgSz w:w="11906" w:h="16838"/>
+      <w:pgMar w:left="992" w:right="992" w:gutter="0" w:header="0" w:top="760" w:footer="636" w:bottom="820"/>
+      <w:pgNumType w:start="1" w:fmt="decimal"/>
+      <w:formProt w:val="false"/>
+      <w:textDirection w:val="lrTb"/>
+      <w:docGrid w:type="default" w:linePitch="100" w:charSpace="0"/>
     </w:sectPr>
   </w:body>
 </w:document>
 </file>
 
-<file path=word/endnotes.xml><?xml version="1.0" encoding="utf-8"?>
-<w:endnotes xmlns:wpc="http://schemas.microsoft.com/office/word/2010/wordprocessingCanvas" xmlns:cx="http://schemas.microsoft.com/office/drawing/2014/chartex" xmlns:cx1="http://schemas.microsoft.com/office/drawing/2015/9/8/chartex" xmlns:cx2="http://schemas.microsoft.com/office/drawing/2015/10/21/chartex" xmlns:cx3="http://schemas.microsoft.com/office/drawing/2016/5/9/chartex" xmlns:cx4="http://schemas.microsoft.com/office/drawing/2016/5/10/chartex" xmlns:cx5="http://schemas.microsoft.com/office/drawing/2016/5/11/chartex" xmlns:cx6="http://schemas.microsoft.com/office/drawing/2016/5/12/chartex" xmlns:cx7="http://schemas.microsoft.com/office/drawing/2016/5/13/chartex" xmlns:cx8="http://schemas.microsoft.com/office/drawing/2016/5/14/chartex" xmlns:mc="http://schemas.openxmlformats.org/markup-compatibility/2006" xmlns:aink="http://schemas.microsoft.com/office/drawing/2016/ink" xmlns:am3d="http://schemas.microsoft.com/office/drawing/2017/model3d" xmlns:o="urn:schemas-microsoft-com:office:office" xmlns:oel="http://schemas.microsoft.com/office/2019/extlst" xmlns:r="http://schemas.openxmlformats.org/officeDocument/2006/relationships" xmlns:m="http://schemas.openxmlformats.org/officeDocument/2006/math" xmlns:v="urn:schemas-microsoft-com:vml" xmlns:wp14="http://schemas.microsoft.com/office/word/2010/wordprocessingDrawing" xmlns:wp="http://schemas.openxmlformats.org/drawingml/2006/wordprocessingDrawing" xmlns:w10="urn:schemas-microsoft-com:office:word" xmlns:w="http://schemas.openxmlformats.org/wordprocessingml/2006/main" xmlns:w14="http://schemas.microsoft.com/office/word/2010/wordml" xmlns:w15="http://schemas.microsoft.com/office/word/2012/wordml" xmlns:w16cex="http://schemas.microsoft.com/office/word/2018/wordml/cex" xmlns:w16cid="http://schemas.microsoft.com/office/word/2016/wordml/cid" xmlns:w16="http://schemas.microsoft.com/office/word/2018/wordml" xmlns:w16du="http://schemas.microsoft.com/office/word/2023/wordml/word16du" xmlns:w16sdtdh="http://schemas.microsoft.com/office/word/2020/wordml/sdtdatahash" xmlns:w16sdtfl="http://schemas.microsoft.com/office/word/2024/wordml/sdtformatlock" xmlns:w16se="http://schemas.microsoft.com/office/word/2015/wordml/symex" xmlns:wpg="http://schemas.microsoft.com/office/word/2010/wordprocessingGroup" xmlns:wpi="http://schemas.microsoft.com/office/word/2010/wordprocessingInk" xmlns:wne="http://schemas.microsoft.com/office/word/2006/wordml" xmlns:wps="http://schemas.microsoft.com/office/word/2010/wordprocessingShape" mc:Ignorable="w14 w15 w16se w16cid w16 w16cex w16sdtdh w16sdtfl w16du wp14">
-  <w:endnote w:type="separator" w:id="-1">
-    <w:p>
-      <w:r>
-        <w:separator/>
-      </w:r>
-    </w:p>
-  </w:endnote>
-  <w:endnote w:type="continuationSeparator" w:id="0">
-    <w:p>
-      <w:r>
-        <w:continuationSeparator/>
-      </w:r>
-    </w:p>
-  </w:endnote>
-</w:endnotes>
+<file path=word/footer1.xml><?xml version="1.0" encoding="utf-8"?>
+<w:ftr xmlns:o="urn:schemas-microsoft-com:office:office" xmlns:r="http://schemas.openxmlformats.org/officeDocument/2006/relationships" xmlns:v="urn:schemas-microsoft-com:vml" xmlns:w="http://schemas.openxmlformats.org/wordprocessingml/2006/main" xmlns:w10="urn:schemas-microsoft-com:office:word" xmlns:wp="http://schemas.openxmlformats.org/drawingml/2006/wordprocessingDrawing" xmlns:pic="http://schemas.openxmlformats.org/drawingml/2006/picture" xmlns:wps="http://schemas.microsoft.com/office/word/2010/wordprocessingShape" xmlns:wpg="http://schemas.microsoft.com/office/word/2010/wordprocessingGroup" xmlns:mc="http://schemas.openxmlformats.org/markup-compatibility/2006" xmlns:wp14="http://schemas.microsoft.com/office/word/2010/wordprocessingDrawing" xmlns:w14="http://schemas.microsoft.com/office/word/2010/wordml" xmlns:w15="http://schemas.microsoft.com/office/word/2012/wordml" mc:Ignorable="w14 wp14 w15">
+  <w:p>
+    <w:pPr>
+      <w:pStyle w:val="Footer"/>
+      <w:rPr/>
+    </w:pPr>
+    <w:r>
+      <w:rPr/>
+    </w:r>
+  </w:p>
+</w:ftr>
 </file>
 
-<file path=word/footer1.xml><?xml version="1.0" encoding="utf-8"?>
-<w:ftr xmlns:wpc="http://schemas.microsoft.com/office/word/2010/wordprocessingCanvas" xmlns:cx="http://schemas.microsoft.com/office/drawing/2014/chartex" xmlns:cx1="http://schemas.microsoft.com/office/drawing/2015/9/8/chartex" xmlns:cx2="http://schemas.microsoft.com/office/drawing/2015/10/21/chartex" xmlns:cx3="http://schemas.microsoft.com/office/drawing/2016/5/9/chartex" xmlns:cx4="http://schemas.microsoft.com/office/drawing/2016/5/10/chartex" xmlns:cx5="http://schemas.microsoft.com/office/drawing/2016/5/11/chartex" xmlns:cx6="http://schemas.microsoft.com/office/drawing/2016/5/12/chartex" xmlns:cx7="http://schemas.microsoft.com/office/drawing/2016/5/13/chartex" xmlns:cx8="http://schemas.microsoft.com/office/drawing/2016/5/14/chartex" xmlns:mc="http://schemas.openxmlformats.org/markup-compatibility/2006" xmlns:aink="http://schemas.microsoft.com/office/drawing/2016/ink" xmlns:am3d="http://schemas.microsoft.com/office/drawing/2017/model3d" xmlns:o="urn:schemas-microsoft-com:office:office" xmlns:oel="http://schemas.microsoft.com/office/2019/extlst" xmlns:r="http://schemas.openxmlformats.org/officeDocument/2006/relationships" xmlns:m="http://schemas.openxmlformats.org/officeDocument/2006/math" xmlns:v="urn:schemas-microsoft-com:vml" xmlns:wp14="http://schemas.microsoft.com/office/word/2010/wordprocessingDrawing" xmlns:wp="http://schemas.openxmlformats.org/drawingml/2006/wordprocessingDrawing" xmlns:w10="urn:schemas-microsoft-com:office:word" xmlns:w="http://schemas.openxmlformats.org/wordprocessingml/2006/main" xmlns:w14="http://schemas.microsoft.com/office/word/2010/wordml" xmlns:w15="http://schemas.microsoft.com/office/word/2012/wordml" xmlns:w16cex="http://schemas.microsoft.com/office/word/2018/wordml/cex" xmlns:w16cid="http://schemas.microsoft.com/office/word/2016/wordml/cid" xmlns:w16="http://schemas.microsoft.com/office/word/2018/wordml" xmlns:w16du="http://schemas.microsoft.com/office/word/2023/wordml/word16du" xmlns:w16sdtdh="http://schemas.microsoft.com/office/word/2020/wordml/sdtdatahash" xmlns:w16sdtfl="http://schemas.microsoft.com/office/word/2024/wordml/sdtformatlock" xmlns:w16se="http://schemas.microsoft.com/office/word/2015/wordml/symex" xmlns:wpg="http://schemas.microsoft.com/office/word/2010/wordprocessingGroup" xmlns:wpi="http://schemas.microsoft.com/office/word/2010/wordprocessingInk" xmlns:wne="http://schemas.microsoft.com/office/word/2006/wordml" xmlns:wps="http://schemas.microsoft.com/office/word/2010/wordprocessingShape" mc:Ignorable="w14 w15 w16se w16cid w16 w16cex w16sdtdh w16sdtfl w16du wp14">
+<file path=word/footer2.xml><?xml version="1.0" encoding="utf-8"?>
+<w:ftr xmlns:o="urn:schemas-microsoft-com:office:office" xmlns:r="http://schemas.openxmlformats.org/officeDocument/2006/relationships" xmlns:v="urn:schemas-microsoft-com:vml" xmlns:w="http://schemas.openxmlformats.org/wordprocessingml/2006/main" xmlns:w10="urn:schemas-microsoft-com:office:word" xmlns:wp="http://schemas.openxmlformats.org/drawingml/2006/wordprocessingDrawing" xmlns:pic="http://schemas.openxmlformats.org/drawingml/2006/picture" xmlns:wps="http://schemas.microsoft.com/office/word/2010/wordprocessingShape" xmlns:wpg="http://schemas.microsoft.com/office/word/2010/wordprocessingGroup" xmlns:mc="http://schemas.openxmlformats.org/markup-compatibility/2006" xmlns:wp14="http://schemas.microsoft.com/office/word/2010/wordprocessingDrawing" xmlns:w14="http://schemas.microsoft.com/office/word/2010/wordml" xmlns:w15="http://schemas.microsoft.com/office/word/2012/wordml" mc:Ignorable="w14 wp14 w15">
   <w:p>
     <w:pPr>
       <w:pStyle w:val="BodyText"/>
-      <w:spacing w:line="14" w:lineRule="auto"/>
+      <w:spacing w:lineRule="auto" w:line="14"/>
+      <w:rPr/>
     </w:pPr>
     <w:r>
-      <w:rPr>
-        <w:noProof/>
-      </w:rPr>
+      <w:rPr/>
       <mc:AlternateContent>
         <mc:Choice Requires="wps">
           <w:drawing>
-            <wp:anchor distT="0" distB="0" distL="0" distR="0" simplePos="0" relativeHeight="487484416" behindDoc="1" locked="0" layoutInCell="1" allowOverlap="1" wp14:anchorId="20118995" wp14:editId="5BD7D898">
+            <wp:anchor distT="0" distB="0" distL="0" distR="0" simplePos="0" relativeHeight="2" behindDoc="1" locked="0" layoutInCell="0" allowOverlap="1" wp14:anchorId="20118995">
               <wp:simplePos x="0" y="0"/>
               <wp:positionH relativeFrom="page">
-                <wp:posOffset>706627</wp:posOffset>
+                <wp:posOffset>706755</wp:posOffset>
               </wp:positionH>
               <wp:positionV relativeFrom="page">
-                <wp:posOffset>10148625</wp:posOffset>
+                <wp:posOffset>10148570</wp:posOffset>
               </wp:positionV>
               <wp:extent cx="976630" cy="111125"/>
               <wp:effectExtent l="0" t="0" r="0" b="0"/>
               <wp:wrapNone/>
-              <wp:docPr id="1" name="Textbox 1"/>
-              <wp:cNvGraphicFramePr>
-                <a:graphicFrameLocks xmlns:a="http://schemas.openxmlformats.org/drawingml/2006/main"/>
-              </wp:cNvGraphicFramePr>
+              <wp:docPr id="2" name="Textbox 1"/>
               <a:graphic xmlns:a="http://schemas.openxmlformats.org/drawingml/2006/main">
                 <a:graphicData uri="http://schemas.microsoft.com/office/word/2010/wordprocessingShape">
                   <wps:wsp>
-                    <wps:cNvSpPr txBox="1">
-                      <a:spLocks/>
-                    </wps:cNvSpPr>
+                    <wps:cNvSpPr/>
                     <wps:spPr>
                       <a:xfrm>
                         <a:off x="0" y="0"/>
-                        <a:ext cx="976630" cy="111125"/>
+                        <a:ext cx="976680" cy="111240"/>
                       </a:xfrm>
                       <a:prstGeom prst="rect">
                         <a:avLst/>
                       </a:prstGeom>
+                      <a:noFill/>
+                      <a:ln w="0">
+                        <a:noFill/>
+                      </a:ln>
                     </wps:spPr>
+                    <wps:style>
+                      <a:lnRef idx="0"/>
+                      <a:fillRef idx="0"/>
+                      <a:effectRef idx="0"/>
+                      <a:fontRef idx="minor"/>
+                    </wps:style>
                     <wps:txbx>
                       <w:txbxContent>
                         <w:p>
                           <w:pPr>
-                            <w:spacing w:before="16"/>
-                            <w:ind w:left="20"/>
+                            <w:pStyle w:val="FrameContents"/>
+                            <w:spacing w:before="16" w:after="0"/>
+                            <w:ind w:start="20"/>
                             <w:rPr>
                               <w:rFonts w:ascii="Arial MT" w:hAnsi="Arial MT"/>
                               <w:sz w:val="12"/>
@@ -2029,7 +2553,7 @@
                         </w:p>
                       </w:txbxContent>
                     </wps:txbx>
-                    <wps:bodyPr wrap="square" lIns="0" tIns="0" rIns="0" bIns="0" rtlCol="0">
+                    <wps:bodyPr lIns="0" tIns="0" rIns="0" bIns="0" anchor="t">
                       <a:noAutofit/>
                     </wps:bodyPr>
                   </wps:wsp>
@@ -2040,17 +2564,16 @@
         </mc:Choice>
         <mc:Fallback>
           <w:pict>
-            <v:shapetype w14:anchorId="20118995" id="_x0000_t202" coordsize="21600,21600" o:spt="202" path="m,l,21600r21600,l21600,xe">
-              <v:stroke joinstyle="miter"/>
-              <v:path gradientshapeok="t" o:connecttype="rect"/>
-            </v:shapetype>
-            <v:shape id="Textbox 1" o:spid="_x0000_s1026" type="#_x0000_t202" style="position:absolute;margin-left:55.65pt;margin-top:799.1pt;width:76.9pt;height:8.75pt;z-index:-15832064;visibility:visible;mso-wrap-style:square;mso-wrap-distance-left:0;mso-wrap-distance-top:0;mso-wrap-distance-right:0;mso-wrap-distance-bottom:0;mso-position-horizontal:absolute;mso-position-horizontal-relative:page;mso-position-vertical:absolute;mso-position-vertical-relative:page;v-text-anchor:top" o:gfxdata="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" filled="f" stroked="f">
-              <v:textbox inset="0,0,0,0">
+            <v:rect id="shape_0" stroked="f" o:allowincell="f" style="position:absolute;margin-left:55.65pt;margin-top:799.1pt;width:76.85pt;height:8.7pt;mso-wrap-style:square;v-text-anchor:top;mso-position-horizontal-relative:page;mso-position-vertical-relative:page" wp14:anchorId="20118995">
+              <v:fill o:detectmouseclick="t" on="false"/>
+              <v:stroke color="#3465a4" joinstyle="round" endcap="flat"/>
+              <v:textbox>
                 <w:txbxContent>
                   <w:p>
                     <w:pPr>
-                      <w:spacing w:before="16"/>
-                      <w:ind w:left="20"/>
+                      <w:pStyle w:val="FrameContents"/>
+                      <w:spacing w:before="16" w:after="0"/>
+                      <w:ind w:start="20"/>
                       <w:rPr>
                         <w:rFonts w:ascii="Arial MT" w:hAnsi="Arial MT"/>
                         <w:sz w:val="12"/>
@@ -2104,55 +2627,56 @@
                   </w:p>
                 </w:txbxContent>
               </v:textbox>
-              <w10:wrap anchorx="page" anchory="page"/>
-            </v:shape>
+              <w10:wrap type="none"/>
+            </v:rect>
           </w:pict>
         </mc:Fallback>
       </mc:AlternateContent>
-    </w:r>
-    <w:r>
-      <w:rPr>
-        <w:noProof/>
-      </w:rPr>
       <mc:AlternateContent>
         <mc:Choice Requires="wps">
           <w:drawing>
-            <wp:anchor distT="0" distB="0" distL="0" distR="0" simplePos="0" relativeHeight="487484928" behindDoc="1" locked="0" layoutInCell="1" allowOverlap="1" wp14:anchorId="029D134B" wp14:editId="5EF9D014">
+            <wp:anchor distT="0" distB="0" distL="0" distR="0" simplePos="0" relativeHeight="4" behindDoc="1" locked="0" layoutInCell="0" allowOverlap="1" wp14:anchorId="029D134B">
               <wp:simplePos x="0" y="0"/>
               <wp:positionH relativeFrom="page">
-                <wp:posOffset>4883277</wp:posOffset>
+                <wp:posOffset>4883150</wp:posOffset>
               </wp:positionH>
               <wp:positionV relativeFrom="page">
-                <wp:posOffset>10148625</wp:posOffset>
+                <wp:posOffset>10148570</wp:posOffset>
               </wp:positionV>
               <wp:extent cx="1935480" cy="197485"/>
               <wp:effectExtent l="0" t="0" r="0" b="0"/>
               <wp:wrapNone/>
-              <wp:docPr id="2" name="Textbox 2"/>
-              <wp:cNvGraphicFramePr>
-                <a:graphicFrameLocks xmlns:a="http://schemas.openxmlformats.org/drawingml/2006/main"/>
-              </wp:cNvGraphicFramePr>
+              <wp:docPr id="3" name="Textbox 2"/>
               <a:graphic xmlns:a="http://schemas.openxmlformats.org/drawingml/2006/main">
                 <a:graphicData uri="http://schemas.microsoft.com/office/word/2010/wordprocessingShape">
                   <wps:wsp>
-                    <wps:cNvSpPr txBox="1">
-                      <a:spLocks/>
-                    </wps:cNvSpPr>
+                    <wps:cNvSpPr/>
                     <wps:spPr>
                       <a:xfrm>
                         <a:off x="0" y="0"/>
-                        <a:ext cx="1935480" cy="197485"/>
+                        <a:ext cx="1935360" cy="197640"/>
                       </a:xfrm>
                       <a:prstGeom prst="rect">
                         <a:avLst/>
                       </a:prstGeom>
+                      <a:noFill/>
+                      <a:ln w="0">
+                        <a:noFill/>
+                      </a:ln>
                     </wps:spPr>
+                    <wps:style>
+                      <a:lnRef idx="0"/>
+                      <a:fillRef idx="0"/>
+                      <a:effectRef idx="0"/>
+                      <a:fontRef idx="minor"/>
+                    </wps:style>
                     <wps:txbx>
                       <w:txbxContent>
                         <w:p>
                           <w:pPr>
-                            <w:spacing w:before="16"/>
-                            <w:ind w:left="20" w:right="18" w:firstLine="374"/>
+                            <w:pStyle w:val="FrameContents"/>
+                            <w:spacing w:before="16" w:after="0"/>
+                            <w:ind w:firstLine="374" w:start="20" w:end="18"/>
                             <w:rPr>
                               <w:i/>
                               <w:sz w:val="12"/>
@@ -2304,7 +2828,7 @@
                         </w:p>
                       </w:txbxContent>
                     </wps:txbx>
-                    <wps:bodyPr wrap="square" lIns="0" tIns="0" rIns="0" bIns="0" rtlCol="0">
+                    <wps:bodyPr lIns="0" tIns="0" rIns="0" bIns="0" anchor="t">
                       <a:noAutofit/>
                     </wps:bodyPr>
                   </wps:wsp>
@@ -2315,13 +2839,16 @@
         </mc:Choice>
         <mc:Fallback>
           <w:pict>
-            <v:shape w14:anchorId="029D134B" id="Textbox 2" o:spid="_x0000_s1027" type="#_x0000_t202" style="position:absolute;margin-left:384.5pt;margin-top:799.1pt;width:152.4pt;height:15.55pt;z-index:-15831552;visibility:visible;mso-wrap-style:square;mso-wrap-distance-left:0;mso-wrap-distance-top:0;mso-wrap-distance-right:0;mso-wrap-distance-bottom:0;mso-position-horizontal:absolute;mso-position-horizontal-relative:page;mso-position-vertical:absolute;mso-position-vertical-relative:page;v-text-anchor:top" o:gfxdata="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" filled="f" stroked="f">
-              <v:textbox inset="0,0,0,0">
+            <v:rect id="shape_0" stroked="f" o:allowincell="f" style="position:absolute;margin-left:384.5pt;margin-top:799.1pt;width:152.35pt;height:15.5pt;mso-wrap-style:square;v-text-anchor:top;mso-position-horizontal-relative:page;mso-position-vertical-relative:page" wp14:anchorId="029D134B">
+              <v:fill o:detectmouseclick="t" on="false"/>
+              <v:stroke color="#3465a4" joinstyle="round" endcap="flat"/>
+              <v:textbox>
                 <w:txbxContent>
                   <w:p>
                     <w:pPr>
-                      <w:spacing w:before="16"/>
-                      <w:ind w:left="20" w:right="18" w:firstLine="374"/>
+                      <w:pStyle w:val="FrameContents"/>
+                      <w:spacing w:before="16" w:after="0"/>
+                      <w:ind w:firstLine="374" w:start="20" w:end="18"/>
                       <w:rPr>
                         <w:i/>
                         <w:sz w:val="12"/>
@@ -2473,8 +3000,8 @@
                   </w:p>
                 </w:txbxContent>
               </v:textbox>
-              <w10:wrap anchorx="page" anchory="page"/>
-            </v:shape>
+              <w10:wrap type="none"/>
+            </v:rect>
           </w:pict>
         </mc:Fallback>
       </mc:AlternateContent>
@@ -2483,31 +3010,577 @@
 </w:ftr>
 </file>
 
-<file path=word/footnotes.xml><?xml version="1.0" encoding="utf-8"?>
-<w:footnotes xmlns:wpc="http://schemas.microsoft.com/office/word/2010/wordprocessingCanvas" xmlns:cx="http://schemas.microsoft.com/office/drawing/2014/chartex" xmlns:cx1="http://schemas.microsoft.com/office/drawing/2015/9/8/chartex" xmlns:cx2="http://schemas.microsoft.com/office/drawing/2015/10/21/chartex" xmlns:cx3="http://schemas.microsoft.com/office/drawing/2016/5/9/chartex" xmlns:cx4="http://schemas.microsoft.com/office/drawing/2016/5/10/chartex" xmlns:cx5="http://schemas.microsoft.com/office/drawing/2016/5/11/chartex" xmlns:cx6="http://schemas.microsoft.com/office/drawing/2016/5/12/chartex" xmlns:cx7="http://schemas.microsoft.com/office/drawing/2016/5/13/chartex" xmlns:cx8="http://schemas.microsoft.com/office/drawing/2016/5/14/chartex" xmlns:mc="http://schemas.openxmlformats.org/markup-compatibility/2006" xmlns:aink="http://schemas.microsoft.com/office/drawing/2016/ink" xmlns:am3d="http://schemas.microsoft.com/office/drawing/2017/model3d" xmlns:o="urn:schemas-microsoft-com:office:office" xmlns:oel="http://schemas.microsoft.com/office/2019/extlst" xmlns:r="http://schemas.openxmlformats.org/officeDocument/2006/relationships" xmlns:m="http://schemas.openxmlformats.org/officeDocument/2006/math" xmlns:v="urn:schemas-microsoft-com:vml" xmlns:wp14="http://schemas.microsoft.com/office/word/2010/wordprocessingDrawing" xmlns:wp="http://schemas.openxmlformats.org/drawingml/2006/wordprocessingDrawing" xmlns:w10="urn:schemas-microsoft-com:office:word" xmlns:w="http://schemas.openxmlformats.org/wordprocessingml/2006/main" xmlns:w14="http://schemas.microsoft.com/office/word/2010/wordml" xmlns:w15="http://schemas.microsoft.com/office/word/2012/wordml" xmlns:w16cex="http://schemas.microsoft.com/office/word/2018/wordml/cex" xmlns:w16cid="http://schemas.microsoft.com/office/word/2016/wordml/cid" xmlns:w16="http://schemas.microsoft.com/office/word/2018/wordml" xmlns:w16du="http://schemas.microsoft.com/office/word/2023/wordml/word16du" xmlns:w16sdtdh="http://schemas.microsoft.com/office/word/2020/wordml/sdtdatahash" xmlns:w16sdtfl="http://schemas.microsoft.com/office/word/2024/wordml/sdtformatlock" xmlns:w16se="http://schemas.microsoft.com/office/word/2015/wordml/symex" xmlns:wpg="http://schemas.microsoft.com/office/word/2010/wordprocessingGroup" xmlns:wpi="http://schemas.microsoft.com/office/word/2010/wordprocessingInk" xmlns:wne="http://schemas.microsoft.com/office/word/2006/wordml" xmlns:wps="http://schemas.microsoft.com/office/word/2010/wordprocessingShape" mc:Ignorable="w14 w15 w16se w16cid w16 w16cex w16sdtdh w16sdtfl w16du wp14">
-  <w:footnote w:type="separator" w:id="-1">
-    <w:p>
-      <w:r>
-        <w:separator/>
-      </w:r>
-    </w:p>
-  </w:footnote>
-  <w:footnote w:type="continuationSeparator" w:id="0">
-    <w:p>
-      <w:r>
-        <w:continuationSeparator/>
-      </w:r>
-    </w:p>
-  </w:footnote>
-</w:footnotes>
+<file path=word/footer3.xml><?xml version="1.0" encoding="utf-8"?>
+<w:ftr xmlns:o="urn:schemas-microsoft-com:office:office" xmlns:r="http://schemas.openxmlformats.org/officeDocument/2006/relationships" xmlns:v="urn:schemas-microsoft-com:vml" xmlns:w="http://schemas.openxmlformats.org/wordprocessingml/2006/main" xmlns:w10="urn:schemas-microsoft-com:office:word" xmlns:wp="http://schemas.openxmlformats.org/drawingml/2006/wordprocessingDrawing" xmlns:pic="http://schemas.openxmlformats.org/drawingml/2006/picture" xmlns:wps="http://schemas.microsoft.com/office/word/2010/wordprocessingShape" xmlns:wpg="http://schemas.microsoft.com/office/word/2010/wordprocessingGroup" xmlns:mc="http://schemas.openxmlformats.org/markup-compatibility/2006" xmlns:wp14="http://schemas.microsoft.com/office/word/2010/wordprocessingDrawing" xmlns:w14="http://schemas.microsoft.com/office/word/2010/wordml" xmlns:w15="http://schemas.microsoft.com/office/word/2012/wordml" mc:Ignorable="w14 wp14 w15">
+  <w:p>
+    <w:pPr>
+      <w:pStyle w:val="BodyText"/>
+      <w:spacing w:lineRule="auto" w:line="14"/>
+      <w:rPr/>
+    </w:pPr>
+    <w:r>
+      <w:rPr/>
+      <mc:AlternateContent>
+        <mc:Choice Requires="wps">
+          <w:drawing>
+            <wp:anchor distT="0" distB="0" distL="0" distR="0" simplePos="0" relativeHeight="2" behindDoc="1" locked="0" layoutInCell="0" allowOverlap="1" wp14:anchorId="20118995">
+              <wp:simplePos x="0" y="0"/>
+              <wp:positionH relativeFrom="page">
+                <wp:posOffset>706755</wp:posOffset>
+              </wp:positionH>
+              <wp:positionV relativeFrom="page">
+                <wp:posOffset>10148570</wp:posOffset>
+              </wp:positionV>
+              <wp:extent cx="976630" cy="111125"/>
+              <wp:effectExtent l="0" t="0" r="0" b="0"/>
+              <wp:wrapNone/>
+              <wp:docPr id="4" name="Textbox 1"/>
+              <a:graphic xmlns:a="http://schemas.openxmlformats.org/drawingml/2006/main">
+                <a:graphicData uri="http://schemas.microsoft.com/office/word/2010/wordprocessingShape">
+                  <wps:wsp>
+                    <wps:cNvSpPr/>
+                    <wps:spPr>
+                      <a:xfrm>
+                        <a:off x="0" y="0"/>
+                        <a:ext cx="976680" cy="111240"/>
+                      </a:xfrm>
+                      <a:prstGeom prst="rect">
+                        <a:avLst/>
+                      </a:prstGeom>
+                      <a:noFill/>
+                      <a:ln w="0">
+                        <a:noFill/>
+                      </a:ln>
+                    </wps:spPr>
+                    <wps:style>
+                      <a:lnRef idx="0"/>
+                      <a:fillRef idx="0"/>
+                      <a:effectRef idx="0"/>
+                      <a:fontRef idx="minor"/>
+                    </wps:style>
+                    <wps:txbx>
+                      <w:txbxContent>
+                        <w:p>
+                          <w:pPr>
+                            <w:pStyle w:val="FrameContents"/>
+                            <w:spacing w:before="16" w:after="0"/>
+                            <w:ind w:start="20"/>
+                            <w:rPr>
+                              <w:rFonts w:ascii="Arial MT" w:hAnsi="Arial MT"/>
+                              <w:sz w:val="12"/>
+                            </w:rPr>
+                          </w:pPr>
+                          <w:r>
+                            <w:rPr>
+                              <w:rFonts w:ascii="Arial MT" w:hAnsi="Arial MT"/>
+                              <w:sz w:val="12"/>
+                            </w:rPr>
+                            <w:t>IEB</w:t>
+                          </w:r>
+                          <w:r>
+                            <w:rPr>
+                              <w:rFonts w:ascii="Arial MT" w:hAnsi="Arial MT"/>
+                              <w:spacing w:val="-3"/>
+                              <w:sz w:val="12"/>
+                            </w:rPr>
+                            <w:t xml:space="preserve"> </w:t>
+                          </w:r>
+                          <w:r>
+                            <w:rPr>
+                              <w:rFonts w:ascii="Arial MT" w:hAnsi="Arial MT"/>
+                              <w:sz w:val="12"/>
+                            </w:rPr>
+                            <w:t>Copyright</w:t>
+                          </w:r>
+                          <w:r>
+                            <w:rPr>
+                              <w:rFonts w:ascii="Arial MT" w:hAnsi="Arial MT"/>
+                              <w:spacing w:val="-2"/>
+                              <w:sz w:val="12"/>
+                            </w:rPr>
+                            <w:t xml:space="preserve"> </w:t>
+                          </w:r>
+                          <w:r>
+                            <w:rPr>
+                              <w:rFonts w:ascii="Arial MT" w:hAnsi="Arial MT"/>
+                              <w:sz w:val="12"/>
+                            </w:rPr>
+                            <w:t>©</w:t>
+                          </w:r>
+                          <w:r>
+                            <w:rPr>
+                              <w:rFonts w:ascii="Arial MT" w:hAnsi="Arial MT"/>
+                              <w:spacing w:val="-2"/>
+                              <w:sz w:val="12"/>
+                            </w:rPr>
+                            <w:t xml:space="preserve"> 2015–2025</w:t>
+                          </w:r>
+                        </w:p>
+                      </w:txbxContent>
+                    </wps:txbx>
+                    <wps:bodyPr lIns="0" tIns="0" rIns="0" bIns="0" anchor="t">
+                      <a:noAutofit/>
+                    </wps:bodyPr>
+                  </wps:wsp>
+                </a:graphicData>
+              </a:graphic>
+            </wp:anchor>
+          </w:drawing>
+        </mc:Choice>
+        <mc:Fallback>
+          <w:pict>
+            <v:rect id="shape_0" stroked="f" o:allowincell="f" style="position:absolute;margin-left:55.65pt;margin-top:799.1pt;width:76.85pt;height:8.7pt;mso-wrap-style:square;v-text-anchor:top;mso-position-horizontal-relative:page;mso-position-vertical-relative:page" wp14:anchorId="20118995">
+              <v:fill o:detectmouseclick="t" on="false"/>
+              <v:stroke color="#3465a4" joinstyle="round" endcap="flat"/>
+              <v:textbox>
+                <w:txbxContent>
+                  <w:p>
+                    <w:pPr>
+                      <w:pStyle w:val="FrameContents"/>
+                      <w:spacing w:before="16" w:after="0"/>
+                      <w:ind w:start="20"/>
+                      <w:rPr>
+                        <w:rFonts w:ascii="Arial MT" w:hAnsi="Arial MT"/>
+                        <w:sz w:val="12"/>
+                      </w:rPr>
+                    </w:pPr>
+                    <w:r>
+                      <w:rPr>
+                        <w:rFonts w:ascii="Arial MT" w:hAnsi="Arial MT"/>
+                        <w:sz w:val="12"/>
+                      </w:rPr>
+                      <w:t>IEB</w:t>
+                    </w:r>
+                    <w:r>
+                      <w:rPr>
+                        <w:rFonts w:ascii="Arial MT" w:hAnsi="Arial MT"/>
+                        <w:spacing w:val="-3"/>
+                        <w:sz w:val="12"/>
+                      </w:rPr>
+                      <w:t xml:space="preserve"> </w:t>
+                    </w:r>
+                    <w:r>
+                      <w:rPr>
+                        <w:rFonts w:ascii="Arial MT" w:hAnsi="Arial MT"/>
+                        <w:sz w:val="12"/>
+                      </w:rPr>
+                      <w:t>Copyright</w:t>
+                    </w:r>
+                    <w:r>
+                      <w:rPr>
+                        <w:rFonts w:ascii="Arial MT" w:hAnsi="Arial MT"/>
+                        <w:spacing w:val="-2"/>
+                        <w:sz w:val="12"/>
+                      </w:rPr>
+                      <w:t xml:space="preserve"> </w:t>
+                    </w:r>
+                    <w:r>
+                      <w:rPr>
+                        <w:rFonts w:ascii="Arial MT" w:hAnsi="Arial MT"/>
+                        <w:sz w:val="12"/>
+                      </w:rPr>
+                      <w:t>©</w:t>
+                    </w:r>
+                    <w:r>
+                      <w:rPr>
+                        <w:rFonts w:ascii="Arial MT" w:hAnsi="Arial MT"/>
+                        <w:spacing w:val="-2"/>
+                        <w:sz w:val="12"/>
+                      </w:rPr>
+                      <w:t xml:space="preserve"> 2015–2025</w:t>
+                    </w:r>
+                  </w:p>
+                </w:txbxContent>
+              </v:textbox>
+              <w10:wrap type="none"/>
+            </v:rect>
+          </w:pict>
+        </mc:Fallback>
+      </mc:AlternateContent>
+      <mc:AlternateContent>
+        <mc:Choice Requires="wps">
+          <w:drawing>
+            <wp:anchor distT="0" distB="0" distL="0" distR="0" simplePos="0" relativeHeight="4" behindDoc="1" locked="0" layoutInCell="0" allowOverlap="1" wp14:anchorId="029D134B">
+              <wp:simplePos x="0" y="0"/>
+              <wp:positionH relativeFrom="page">
+                <wp:posOffset>4883150</wp:posOffset>
+              </wp:positionH>
+              <wp:positionV relativeFrom="page">
+                <wp:posOffset>10148570</wp:posOffset>
+              </wp:positionV>
+              <wp:extent cx="1935480" cy="197485"/>
+              <wp:effectExtent l="0" t="0" r="0" b="0"/>
+              <wp:wrapNone/>
+              <wp:docPr id="5" name="Textbox 2"/>
+              <a:graphic xmlns:a="http://schemas.openxmlformats.org/drawingml/2006/main">
+                <a:graphicData uri="http://schemas.microsoft.com/office/word/2010/wordprocessingShape">
+                  <wps:wsp>
+                    <wps:cNvSpPr/>
+                    <wps:spPr>
+                      <a:xfrm>
+                        <a:off x="0" y="0"/>
+                        <a:ext cx="1935360" cy="197640"/>
+                      </a:xfrm>
+                      <a:prstGeom prst="rect">
+                        <a:avLst/>
+                      </a:prstGeom>
+                      <a:noFill/>
+                      <a:ln w="0">
+                        <a:noFill/>
+                      </a:ln>
+                    </wps:spPr>
+                    <wps:style>
+                      <a:lnRef idx="0"/>
+                      <a:fillRef idx="0"/>
+                      <a:effectRef idx="0"/>
+                      <a:fontRef idx="minor"/>
+                    </wps:style>
+                    <wps:txbx>
+                      <w:txbxContent>
+                        <w:p>
+                          <w:pPr>
+                            <w:pStyle w:val="FrameContents"/>
+                            <w:spacing w:before="16" w:after="0"/>
+                            <w:ind w:firstLine="374" w:start="20" w:end="18"/>
+                            <w:rPr>
+                              <w:i/>
+                              <w:sz w:val="12"/>
+                            </w:rPr>
+                          </w:pPr>
+                          <w:r>
+                            <w:rPr>
+                              <w:i/>
+                              <w:sz w:val="12"/>
+                            </w:rPr>
+                            <w:t>NATIONAL</w:t>
+                          </w:r>
+                          <w:r>
+                            <w:rPr>
+                              <w:i/>
+                              <w:spacing w:val="-11"/>
+                              <w:sz w:val="12"/>
+                            </w:rPr>
+                            <w:t xml:space="preserve"> </w:t>
+                          </w:r>
+                          <w:r>
+                            <w:rPr>
+                              <w:i/>
+                              <w:sz w:val="12"/>
+                            </w:rPr>
+                            <w:t>SENIOR</w:t>
+                          </w:r>
+                          <w:r>
+                            <w:rPr>
+                              <w:i/>
+                              <w:spacing w:val="-8"/>
+                              <w:sz w:val="12"/>
+                            </w:rPr>
+                            <w:t xml:space="preserve"> </w:t>
+                          </w:r>
+                          <w:r>
+                            <w:rPr>
+                              <w:i/>
+                              <w:sz w:val="12"/>
+                            </w:rPr>
+                            <w:t>CERTIFICATE</w:t>
+                          </w:r>
+                          <w:r>
+                            <w:rPr>
+                              <w:i/>
+                              <w:spacing w:val="-8"/>
+                              <w:sz w:val="12"/>
+                            </w:rPr>
+                            <w:t xml:space="preserve"> </w:t>
+                          </w:r>
+                          <w:r>
+                            <w:rPr>
+                              <w:i/>
+                              <w:sz w:val="12"/>
+                            </w:rPr>
+                            <w:t>HANDBOOK</w:t>
+                          </w:r>
+                          <w:r>
+                            <w:rPr>
+                              <w:i/>
+                              <w:spacing w:val="40"/>
+                              <w:sz w:val="12"/>
+                            </w:rPr>
+                            <w:t xml:space="preserve"> </w:t>
+                          </w:r>
+                          <w:r>
+                            <w:rPr>
+                              <w:i/>
+                              <w:sz w:val="12"/>
+                            </w:rPr>
+                            <w:t>IMPLEMENTATION</w:t>
+                          </w:r>
+                          <w:r>
+                            <w:rPr>
+                              <w:i/>
+                              <w:spacing w:val="-5"/>
+                              <w:sz w:val="12"/>
+                            </w:rPr>
+                            <w:t xml:space="preserve"> </w:t>
+                          </w:r>
+                          <w:r>
+                            <w:rPr>
+                              <w:i/>
+                              <w:sz w:val="12"/>
+                            </w:rPr>
+                            <w:t>DATE:</w:t>
+                          </w:r>
+                          <w:r>
+                            <w:rPr>
+                              <w:i/>
+                              <w:spacing w:val="-4"/>
+                              <w:sz w:val="12"/>
+                            </w:rPr>
+                            <w:t xml:space="preserve"> </w:t>
+                          </w:r>
+                          <w:r>
+                            <w:rPr>
+                              <w:i/>
+                              <w:sz w:val="12"/>
+                            </w:rPr>
+                            <w:t>GRADE</w:t>
+                          </w:r>
+                          <w:r>
+                            <w:rPr>
+                              <w:i/>
+                              <w:spacing w:val="-6"/>
+                              <w:sz w:val="12"/>
+                            </w:rPr>
+                            <w:t xml:space="preserve"> </w:t>
+                          </w:r>
+                          <w:r>
+                            <w:rPr>
+                              <w:i/>
+                              <w:sz w:val="12"/>
+                            </w:rPr>
+                            <w:t>12,</w:t>
+                          </w:r>
+                          <w:r>
+                            <w:rPr>
+                              <w:i/>
+                              <w:spacing w:val="-4"/>
+                              <w:sz w:val="12"/>
+                            </w:rPr>
+                            <w:t xml:space="preserve"> </w:t>
+                          </w:r>
+                          <w:r>
+                            <w:rPr>
+                              <w:i/>
+                              <w:sz w:val="12"/>
+                            </w:rPr>
+                            <w:t>JANUARY</w:t>
+                          </w:r>
+                          <w:r>
+                            <w:rPr>
+                              <w:i/>
+                              <w:spacing w:val="-6"/>
+                              <w:sz w:val="12"/>
+                            </w:rPr>
+                            <w:t xml:space="preserve"> </w:t>
+                          </w:r>
+                          <w:r>
+                            <w:rPr>
+                              <w:i/>
+                              <w:spacing w:val="-4"/>
+                              <w:sz w:val="12"/>
+                            </w:rPr>
+                            <w:t>2025</w:t>
+                          </w:r>
+                        </w:p>
+                      </w:txbxContent>
+                    </wps:txbx>
+                    <wps:bodyPr lIns="0" tIns="0" rIns="0" bIns="0" anchor="t">
+                      <a:noAutofit/>
+                    </wps:bodyPr>
+                  </wps:wsp>
+                </a:graphicData>
+              </a:graphic>
+            </wp:anchor>
+          </w:drawing>
+        </mc:Choice>
+        <mc:Fallback>
+          <w:pict>
+            <v:rect id="shape_0" stroked="f" o:allowincell="f" style="position:absolute;margin-left:384.5pt;margin-top:799.1pt;width:152.35pt;height:15.5pt;mso-wrap-style:square;v-text-anchor:top;mso-position-horizontal-relative:page;mso-position-vertical-relative:page" wp14:anchorId="029D134B">
+              <v:fill o:detectmouseclick="t" on="false"/>
+              <v:stroke color="#3465a4" joinstyle="round" endcap="flat"/>
+              <v:textbox>
+                <w:txbxContent>
+                  <w:p>
+                    <w:pPr>
+                      <w:pStyle w:val="FrameContents"/>
+                      <w:spacing w:before="16" w:after="0"/>
+                      <w:ind w:firstLine="374" w:start="20" w:end="18"/>
+                      <w:rPr>
+                        <w:i/>
+                        <w:sz w:val="12"/>
+                      </w:rPr>
+                    </w:pPr>
+                    <w:r>
+                      <w:rPr>
+                        <w:i/>
+                        <w:sz w:val="12"/>
+                      </w:rPr>
+                      <w:t>NATIONAL</w:t>
+                    </w:r>
+                    <w:r>
+                      <w:rPr>
+                        <w:i/>
+                        <w:spacing w:val="-11"/>
+                        <w:sz w:val="12"/>
+                      </w:rPr>
+                      <w:t xml:space="preserve"> </w:t>
+                    </w:r>
+                    <w:r>
+                      <w:rPr>
+                        <w:i/>
+                        <w:sz w:val="12"/>
+                      </w:rPr>
+                      <w:t>SENIOR</w:t>
+                    </w:r>
+                    <w:r>
+                      <w:rPr>
+                        <w:i/>
+                        <w:spacing w:val="-8"/>
+                        <w:sz w:val="12"/>
+                      </w:rPr>
+                      <w:t xml:space="preserve"> </w:t>
+                    </w:r>
+                    <w:r>
+                      <w:rPr>
+                        <w:i/>
+                        <w:sz w:val="12"/>
+                      </w:rPr>
+                      <w:t>CERTIFICATE</w:t>
+                    </w:r>
+                    <w:r>
+                      <w:rPr>
+                        <w:i/>
+                        <w:spacing w:val="-8"/>
+                        <w:sz w:val="12"/>
+                      </w:rPr>
+                      <w:t xml:space="preserve"> </w:t>
+                    </w:r>
+                    <w:r>
+                      <w:rPr>
+                        <w:i/>
+                        <w:sz w:val="12"/>
+                      </w:rPr>
+                      <w:t>HANDBOOK</w:t>
+                    </w:r>
+                    <w:r>
+                      <w:rPr>
+                        <w:i/>
+                        <w:spacing w:val="40"/>
+                        <w:sz w:val="12"/>
+                      </w:rPr>
+                      <w:t xml:space="preserve"> </w:t>
+                    </w:r>
+                    <w:r>
+                      <w:rPr>
+                        <w:i/>
+                        <w:sz w:val="12"/>
+                      </w:rPr>
+                      <w:t>IMPLEMENTATION</w:t>
+                    </w:r>
+                    <w:r>
+                      <w:rPr>
+                        <w:i/>
+                        <w:spacing w:val="-5"/>
+                        <w:sz w:val="12"/>
+                      </w:rPr>
+                      <w:t xml:space="preserve"> </w:t>
+                    </w:r>
+                    <w:r>
+                      <w:rPr>
+                        <w:i/>
+                        <w:sz w:val="12"/>
+                      </w:rPr>
+                      <w:t>DATE:</w:t>
+                    </w:r>
+                    <w:r>
+                      <w:rPr>
+                        <w:i/>
+                        <w:spacing w:val="-4"/>
+                        <w:sz w:val="12"/>
+                      </w:rPr>
+                      <w:t xml:space="preserve"> </w:t>
+                    </w:r>
+                    <w:r>
+                      <w:rPr>
+                        <w:i/>
+                        <w:sz w:val="12"/>
+                      </w:rPr>
+                      <w:t>GRADE</w:t>
+                    </w:r>
+                    <w:r>
+                      <w:rPr>
+                        <w:i/>
+                        <w:spacing w:val="-6"/>
+                        <w:sz w:val="12"/>
+                      </w:rPr>
+                      <w:t xml:space="preserve"> </w:t>
+                    </w:r>
+                    <w:r>
+                      <w:rPr>
+                        <w:i/>
+                        <w:sz w:val="12"/>
+                      </w:rPr>
+                      <w:t>12,</w:t>
+                    </w:r>
+                    <w:r>
+                      <w:rPr>
+                        <w:i/>
+                        <w:spacing w:val="-4"/>
+                        <w:sz w:val="12"/>
+                      </w:rPr>
+                      <w:t xml:space="preserve"> </w:t>
+                    </w:r>
+                    <w:r>
+                      <w:rPr>
+                        <w:i/>
+                        <w:sz w:val="12"/>
+                      </w:rPr>
+                      <w:t>JANUARY</w:t>
+                    </w:r>
+                    <w:r>
+                      <w:rPr>
+                        <w:i/>
+                        <w:spacing w:val="-6"/>
+                        <w:sz w:val="12"/>
+                      </w:rPr>
+                      <w:t xml:space="preserve"> </w:t>
+                    </w:r>
+                    <w:r>
+                      <w:rPr>
+                        <w:i/>
+                        <w:spacing w:val="-4"/>
+                        <w:sz w:val="12"/>
+                      </w:rPr>
+                      <w:t>2025</w:t>
+                    </w:r>
+                  </w:p>
+                </w:txbxContent>
+              </v:textbox>
+              <w10:wrap type="none"/>
+            </v:rect>
+          </w:pict>
+        </mc:Fallback>
+      </mc:AlternateContent>
+    </w:r>
+  </w:p>
+</w:ftr>
 </file>
 
 <file path=word/styles.xml><?xml version="1.0" encoding="utf-8"?>
-<w:styles xmlns:mc="http://schemas.openxmlformats.org/markup-compatibility/2006" xmlns:r="http://schemas.openxmlformats.org/officeDocument/2006/relationships" xmlns:w="http://schemas.openxmlformats.org/wordprocessingml/2006/main" xmlns:w14="http://schemas.microsoft.com/office/word/2010/wordml" xmlns:w15="http://schemas.microsoft.com/office/word/2012/wordml" xmlns:w16cex="http://schemas.microsoft.com/office/word/2018/wordml/cex" xmlns:w16cid="http://schemas.microsoft.com/office/word/2016/wordml/cid" xmlns:w16="http://schemas.microsoft.com/office/word/2018/wordml" xmlns:w16du="http://schemas.microsoft.com/office/word/2023/wordml/word16du" xmlns:w16sdtdh="http://schemas.microsoft.com/office/word/2020/wordml/sdtdatahash" xmlns:w16sdtfl="http://schemas.microsoft.com/office/word/2024/wordml/sdtformatlock" xmlns:w16se="http://schemas.microsoft.com/office/word/2015/wordml/symex" mc:Ignorable="w14 w15 w16se w16cid w16 w16cex w16sdtdh w16sdtfl w16du">
+<w:styles xmlns:w="http://schemas.openxmlformats.org/wordprocessingml/2006/main" xmlns:w14="http://schemas.microsoft.com/office/word/2010/wordml" xmlns:mc="http://schemas.openxmlformats.org/markup-compatibility/2006" mc:Ignorable="w14">
   <w:docDefaults>
     <w:rPrDefault>
       <w:rPr>
-        <w:rFonts w:asciiTheme="minorHAnsi" w:eastAsiaTheme="minorHAnsi" w:hAnsiTheme="minorHAnsi" w:cstheme="minorBidi"/>
+        <w:rFonts w:ascii="Calibri" w:hAnsi="Calibri" w:eastAsia="Calibri" w:cs="" w:asciiTheme="minorHAnsi" w:cstheme="minorBidi" w:eastAsiaTheme="minorHAnsi" w:hAnsiTheme="minorHAnsi"/>
         <w:sz w:val="22"/>
         <w:szCs w:val="22"/>
         <w:lang w:val="en-US" w:eastAsia="en-US" w:bidi="ar-SA"/>
@@ -2515,23 +3588,21 @@
     </w:rPrDefault>
     <w:pPrDefault>
       <w:pPr>
-        <w:widowControl w:val="0"/>
-        <w:autoSpaceDE w:val="0"/>
-        <w:autoSpaceDN w:val="0"/>
+        <w:suppressAutoHyphens w:val="true"/>
       </w:pPr>
     </w:pPrDefault>
   </w:docDefaults>
   <w:latentStyles w:defLockedState="0" w:defUIPriority="99" w:defSemiHidden="0" w:defUnhideWhenUsed="0" w:defQFormat="0" w:count="376">
     <w:lsdException w:name="Normal" w:uiPriority="0" w:qFormat="1"/>
     <w:lsdException w:name="heading 1" w:uiPriority="9" w:qFormat="1"/>
-    <w:lsdException w:name="heading 2" w:semiHidden="1" w:uiPriority="9" w:unhideWhenUsed="1" w:qFormat="1"/>
-    <w:lsdException w:name="heading 3" w:semiHidden="1" w:uiPriority="9" w:unhideWhenUsed="1" w:qFormat="1"/>
-    <w:lsdException w:name="heading 4" w:semiHidden="1" w:uiPriority="9" w:unhideWhenUsed="1" w:qFormat="1"/>
-    <w:lsdException w:name="heading 5" w:semiHidden="1" w:uiPriority="9" w:unhideWhenUsed="1" w:qFormat="1"/>
-    <w:lsdException w:name="heading 6" w:semiHidden="1" w:uiPriority="9" w:unhideWhenUsed="1" w:qFormat="1"/>
-    <w:lsdException w:name="heading 7" w:semiHidden="1" w:uiPriority="9" w:unhideWhenUsed="1" w:qFormat="1"/>
-    <w:lsdException w:name="heading 8" w:semiHidden="1" w:uiPriority="9" w:unhideWhenUsed="1" w:qFormat="1"/>
-    <w:lsdException w:name="heading 9" w:semiHidden="1" w:uiPriority="9" w:unhideWhenUsed="1" w:qFormat="1"/>
+    <w:lsdException w:name="heading 2" w:uiPriority="9" w:semiHidden="1" w:unhideWhenUsed="1" w:qFormat="1"/>
+    <w:lsdException w:name="heading 3" w:uiPriority="9" w:semiHidden="1" w:unhideWhenUsed="1" w:qFormat="1"/>
+    <w:lsdException w:name="heading 4" w:uiPriority="9" w:semiHidden="1" w:unhideWhenUsed="1" w:qFormat="1"/>
+    <w:lsdException w:name="heading 5" w:uiPriority="9" w:semiHidden="1" w:unhideWhenUsed="1" w:qFormat="1"/>
+    <w:lsdException w:name="heading 6" w:uiPriority="9" w:semiHidden="1" w:unhideWhenUsed="1" w:qFormat="1"/>
+    <w:lsdException w:name="heading 7" w:uiPriority="9" w:semiHidden="1" w:unhideWhenUsed="1" w:qFormat="1"/>
+    <w:lsdException w:name="heading 8" w:uiPriority="9" w:semiHidden="1" w:unhideWhenUsed="1" w:qFormat="1"/>
+    <w:lsdException w:name="heading 9" w:uiPriority="9" w:semiHidden="1" w:unhideWhenUsed="1" w:qFormat="1"/>
     <w:lsdException w:name="index 1" w:semiHidden="1" w:unhideWhenUsed="1"/>
     <w:lsdException w:name="index 2" w:semiHidden="1" w:unhideWhenUsed="1"/>
     <w:lsdException w:name="index 3" w:semiHidden="1" w:unhideWhenUsed="1"/>
@@ -2541,22 +3612,22 @@
     <w:lsdException w:name="index 7" w:semiHidden="1" w:unhideWhenUsed="1"/>
     <w:lsdException w:name="index 8" w:semiHidden="1" w:unhideWhenUsed="1"/>
     <w:lsdException w:name="index 9" w:semiHidden="1" w:unhideWhenUsed="1"/>
-    <w:lsdException w:name="toc 1" w:semiHidden="1" w:uiPriority="39" w:unhideWhenUsed="1"/>
-    <w:lsdException w:name="toc 2" w:semiHidden="1" w:uiPriority="39" w:unhideWhenUsed="1"/>
-    <w:lsdException w:name="toc 3" w:semiHidden="1" w:uiPriority="39" w:unhideWhenUsed="1"/>
-    <w:lsdException w:name="toc 4" w:semiHidden="1" w:uiPriority="39" w:unhideWhenUsed="1"/>
-    <w:lsdException w:name="toc 5" w:semiHidden="1" w:uiPriority="39" w:unhideWhenUsed="1"/>
-    <w:lsdException w:name="toc 6" w:semiHidden="1" w:uiPriority="39" w:unhideWhenUsed="1"/>
-    <w:lsdException w:name="toc 7" w:semiHidden="1" w:uiPriority="39" w:unhideWhenUsed="1"/>
-    <w:lsdException w:name="toc 8" w:semiHidden="1" w:uiPriority="39" w:unhideWhenUsed="1"/>
-    <w:lsdException w:name="toc 9" w:semiHidden="1" w:uiPriority="39" w:unhideWhenUsed="1"/>
+    <w:lsdException w:name="toc 1" w:uiPriority="39" w:semiHidden="1" w:unhideWhenUsed="1"/>
+    <w:lsdException w:name="toc 2" w:uiPriority="39" w:semiHidden="1" w:unhideWhenUsed="1"/>
+    <w:lsdException w:name="toc 3" w:uiPriority="39" w:semiHidden="1" w:unhideWhenUsed="1"/>
+    <w:lsdException w:name="toc 4" w:uiPriority="39" w:semiHidden="1" w:unhideWhenUsed="1"/>
+    <w:lsdException w:name="toc 5" w:uiPriority="39" w:semiHidden="1" w:unhideWhenUsed="1"/>
+    <w:lsdException w:name="toc 6" w:uiPriority="39" w:semiHidden="1" w:unhideWhenUsed="1"/>
+    <w:lsdException w:name="toc 7" w:uiPriority="39" w:semiHidden="1" w:unhideWhenUsed="1"/>
+    <w:lsdException w:name="toc 8" w:uiPriority="39" w:semiHidden="1" w:unhideWhenUsed="1"/>
+    <w:lsdException w:name="toc 9" w:uiPriority="39" w:semiHidden="1" w:unhideWhenUsed="1"/>
     <w:lsdException w:name="Normal Indent" w:semiHidden="1" w:unhideWhenUsed="1"/>
     <w:lsdException w:name="footnote text" w:semiHidden="1" w:unhideWhenUsed="1"/>
     <w:lsdException w:name="annotation text" w:semiHidden="1" w:unhideWhenUsed="1"/>
     <w:lsdException w:name="header" w:semiHidden="1" w:unhideWhenUsed="1"/>
     <w:lsdException w:name="footer" w:semiHidden="1" w:unhideWhenUsed="1"/>
     <w:lsdException w:name="index heading" w:semiHidden="1" w:unhideWhenUsed="1"/>
-    <w:lsdException w:name="caption" w:semiHidden="1" w:uiPriority="35" w:unhideWhenUsed="1" w:qFormat="1"/>
+    <w:lsdException w:name="caption" w:uiPriority="35" w:semiHidden="1" w:unhideWhenUsed="1" w:qFormat="1"/>
     <w:lsdException w:name="table of figures" w:semiHidden="1" w:unhideWhenUsed="1"/>
     <w:lsdException w:name="envelope address" w:semiHidden="1" w:unhideWhenUsed="1"/>
     <w:lsdException w:name="envelope return" w:semiHidden="1" w:unhideWhenUsed="1"/>
@@ -2587,7 +3658,7 @@
     <w:lsdException w:name="Title" w:uiPriority="10" w:qFormat="1"/>
     <w:lsdException w:name="Closing" w:semiHidden="1" w:unhideWhenUsed="1"/>
     <w:lsdException w:name="Signature" w:semiHidden="1" w:unhideWhenUsed="1"/>
-    <w:lsdException w:name="Default Paragraph Font" w:semiHidden="1" w:uiPriority="1" w:unhideWhenUsed="1"/>
+    <w:lsdException w:name="Default Paragraph Font" w:uiPriority="1" w:semiHidden="1" w:unhideWhenUsed="1"/>
     <w:lsdException w:name="Body Text" w:semiHidden="1" w:unhideWhenUsed="1"/>
     <w:lsdException w:name="Body Text Indent" w:semiHidden="1" w:unhideWhenUsed="1"/>
     <w:lsdException w:name="List Continue" w:semiHidden="1" w:unhideWhenUsed="1"/>
@@ -2787,8 +3858,8 @@
     <w:lsdException w:name="Subtle Reference" w:uiPriority="31" w:qFormat="1"/>
     <w:lsdException w:name="Intense Reference" w:uiPriority="32" w:qFormat="1"/>
     <w:lsdException w:name="Book Title" w:uiPriority="33" w:qFormat="1"/>
-    <w:lsdException w:name="Bibliography" w:semiHidden="1" w:uiPriority="37" w:unhideWhenUsed="1"/>
-    <w:lsdException w:name="TOC Heading" w:semiHidden="1" w:uiPriority="39" w:unhideWhenUsed="1" w:qFormat="1"/>
+    <w:lsdException w:name="Bibliography" w:uiPriority="37" w:semiHidden="1" w:unhideWhenUsed="1"/>
+    <w:lsdException w:name="TOC Heading" w:uiPriority="39" w:semiHidden="1" w:unhideWhenUsed="1" w:qFormat="1"/>
     <w:lsdException w:name="Plain Table 1" w:uiPriority="41"/>
     <w:lsdException w:name="Plain Table 2" w:uiPriority="42"/>
     <w:lsdException w:name="Plain Table 3" w:uiPriority="43"/>
@@ -2899,48 +3970,91 @@
     <w:lsdException w:name="Unresolved Mention" w:semiHidden="1" w:unhideWhenUsed="1"/>
     <w:lsdException w:name="Smart Link" w:semiHidden="1" w:unhideWhenUsed="1"/>
   </w:latentStyles>
-  <w:style w:type="paragraph" w:default="1" w:styleId="Normal">
+  <w:style w:type="paragraph" w:styleId="Normal" w:default="1">
     <w:name w:val="Normal"/>
     <w:qFormat/>
+    <w:pPr>
+      <w:widowControl w:val="false"/>
+      <w:bidi w:val="0"/>
+      <w:spacing w:before="0" w:after="0"/>
+      <w:jc w:val="start"/>
+    </w:pPr>
     <w:rPr>
-      <w:rFonts w:ascii="Arial" w:eastAsia="Arial" w:hAnsi="Arial" w:cs="Arial"/>
+      <w:rFonts w:ascii="Arial" w:hAnsi="Arial" w:eastAsia="Arial" w:cs="Arial"/>
+      <w:color w:val="auto"/>
+      <w:kern w:val="0"/>
+      <w:sz w:val="22"/>
+      <w:szCs w:val="22"/>
+      <w:lang w:val="en-US" w:eastAsia="en-US" w:bidi="ar-SA"/>
     </w:rPr>
   </w:style>
-  <w:style w:type="character" w:default="1" w:styleId="DefaultParagraphFont">
+  <w:style w:type="character" w:styleId="DefaultParagraphFont" w:default="1">
     <w:name w:val="Default Paragraph Font"/>
     <w:uiPriority w:val="1"/>
     <w:unhideWhenUsed/>
+    <w:qFormat/>
+    <w:rPr/>
   </w:style>
-  <w:style w:type="table" w:default="1" w:styleId="TableNormal">
-    <w:name w:val="Normal Table"/>
-    <w:uiPriority w:val="99"/>
-    <w:semiHidden/>
-    <w:unhideWhenUsed/>
-    <w:tblPr>
-      <w:tblInd w:w="0" w:type="dxa"/>
-      <w:tblCellMar>
-        <w:top w:w="0" w:type="dxa"/>
-        <w:left w:w="108" w:type="dxa"/>
-        <w:bottom w:w="0" w:type="dxa"/>
-        <w:right w:w="108" w:type="dxa"/>
-      </w:tblCellMar>
-    </w:tblPr>
-  </w:style>
-  <w:style w:type="numbering" w:default="1" w:styleId="NoList">
-    <w:name w:val="No List"/>
-    <w:uiPriority w:val="99"/>
-    <w:semiHidden/>
-    <w:unhideWhenUsed/>
+  <w:style w:type="paragraph" w:styleId="Heading">
+    <w:name w:val="Heading"/>
+    <w:basedOn w:val="Normal"/>
+    <w:next w:val="BodyText"/>
+    <w:qFormat/>
+    <w:pPr>
+      <w:keepNext w:val="true"/>
+      <w:spacing w:before="240" w:after="120"/>
+    </w:pPr>
+    <w:rPr>
+      <w:rFonts w:ascii="Liberation Sans" w:hAnsi="Liberation Sans" w:eastAsia="Microsoft YaHei" w:cs="Lucida Sans"/>
+      <w:sz w:val="28"/>
+      <w:szCs w:val="28"/>
+    </w:rPr>
   </w:style>
   <w:style w:type="paragraph" w:styleId="BodyText">
     <w:name w:val="Body Text"/>
     <w:basedOn w:val="Normal"/>
     <w:uiPriority w:val="1"/>
     <w:qFormat/>
+    <w:pPr/>
     <w:rPr>
-      <w:rFonts w:ascii="Arial MT" w:eastAsia="Arial MT" w:hAnsi="Arial MT" w:cs="Arial MT"/>
+      <w:rFonts w:ascii="Arial MT" w:hAnsi="Arial MT" w:eastAsia="Arial MT" w:cs="Arial MT"/>
       <w:sz w:val="20"/>
       <w:szCs w:val="20"/>
+    </w:rPr>
+  </w:style>
+  <w:style w:type="paragraph" w:styleId="List">
+    <w:name w:val="List"/>
+    <w:basedOn w:val="BodyText"/>
+    <w:pPr/>
+    <w:rPr>
+      <w:rFonts w:cs="Lucida Sans"/>
+    </w:rPr>
+  </w:style>
+  <w:style w:type="paragraph" w:styleId="Caption">
+    <w:name w:val="caption"/>
+    <w:basedOn w:val="Normal"/>
+    <w:qFormat/>
+    <w:pPr>
+      <w:suppressLineNumbers/>
+      <w:spacing w:before="120" w:after="120"/>
+    </w:pPr>
+    <w:rPr>
+      <w:rFonts w:cs="Lucida Sans"/>
+      <w:i/>
+      <w:iCs/>
+      <w:sz w:val="24"/>
+      <w:szCs w:val="24"/>
+    </w:rPr>
+  </w:style>
+  <w:style w:type="paragraph" w:styleId="Index">
+    <w:name w:val="Index"/>
+    <w:basedOn w:val="Normal"/>
+    <w:qFormat/>
+    <w:pPr>
+      <w:suppressLineNumbers/>
+    </w:pPr>
+    <w:rPr>
+      <w:rFonts w:cs="Lucida Sans"/>
     </w:rPr>
   </w:style>
   <w:style w:type="paragraph" w:styleId="Title">
@@ -2949,7 +4063,7 @@
     <w:uiPriority w:val="10"/>
     <w:qFormat/>
     <w:pPr>
-      <w:ind w:left="2283" w:right="181"/>
+      <w:ind w:start="2283" w:end="181"/>
       <w:jc w:val="center"/>
     </w:pPr>
     <w:rPr>
@@ -2964,34 +4078,74 @@
     <w:basedOn w:val="Normal"/>
     <w:uiPriority w:val="1"/>
     <w:qFormat/>
+    <w:pPr/>
+    <w:rPr/>
   </w:style>
-  <w:style w:type="paragraph" w:customStyle="1" w:styleId="TableParagraph">
+  <w:style w:type="paragraph" w:styleId="TableParagraph" w:customStyle="1">
     <w:name w:val="Table Paragraph"/>
     <w:basedOn w:val="Normal"/>
     <w:uiPriority w:val="1"/>
     <w:qFormat/>
+    <w:pPr/>
+    <w:rPr/>
+  </w:style>
+  <w:style w:type="paragraph" w:styleId="HeaderandFooter">
+    <w:name w:val="Header and Footer"/>
+    <w:basedOn w:val="Normal"/>
+    <w:qFormat/>
+    <w:pPr/>
+    <w:rPr/>
+  </w:style>
+  <w:style w:type="paragraph" w:styleId="Footer">
+    <w:name w:val="footer"/>
+    <w:basedOn w:val="HeaderandFooter"/>
+    <w:pPr/>
+    <w:rPr/>
+  </w:style>
+  <w:style w:type="paragraph" w:styleId="FrameContents">
+    <w:name w:val="Frame Contents"/>
+    <w:basedOn w:val="Normal"/>
+    <w:qFormat/>
+    <w:pPr/>
+    <w:rPr/>
+  </w:style>
+  <w:style w:type="numbering" w:styleId="NoList" w:default="1">
+    <w:name w:val="No List"/>
+    <w:uiPriority w:val="99"/>
+    <w:semiHidden/>
+    <w:unhideWhenUsed/>
+    <w:qFormat/>
+  </w:style>
+  <w:style w:type="table" w:default="1" w:styleId="TableNormal">
+    <w:name w:val="Normal Table"/>
+    <w:uiPriority w:val="99"/>
+    <w:semiHidden/>
+    <w:unhideWhenUsed/>
+    <w:tblPr>
+      <w:tblCellMar>
+        <w:top w:w="0" w:type="dxa"/>
+        <w:left w:w="108" w:type="dxa"/>
+        <w:bottom w:w="0" w:type="dxa"/>
+        <w:right w:w="108" w:type="dxa"/>
+      </w:tblCellMar>
+    </w:tblPr>
   </w:style>
   <w:style w:type="table" w:styleId="TableGrid">
     <w:name w:val="Table Grid"/>
     <w:basedOn w:val="TableNormal"/>
     <w:uiPriority w:val="39"/>
-    <w:rsid w:val="00CC4EE5"/>
-    <w:pPr>
-      <w:widowControl/>
-      <w:autoSpaceDE/>
-      <w:autoSpaceDN/>
-    </w:pPr>
+    <w:rsid w:val="00cc4ee5"/>
     <w:rPr>
       <w:rFonts w:eastAsiaTheme="minorEastAsia"/>
     </w:rPr>
     <w:tblPr>
       <w:tblBorders>
-        <w:top w:val="single" w:sz="4" w:space="0" w:color="auto"/>
-        <w:left w:val="single" w:sz="4" w:space="0" w:color="auto"/>
-        <w:bottom w:val="single" w:sz="4" w:space="0" w:color="auto"/>
-        <w:right w:val="single" w:sz="4" w:space="0" w:color="auto"/>
-        <w:insideH w:val="single" w:sz="4" w:space="0" w:color="auto"/>
-        <w:insideV w:val="single" w:sz="4" w:space="0" w:color="auto"/>
+        <w:top w:val="single" w:color="auto" w:sz="4" w:space="0"/>
+        <w:left w:val="single" w:color="auto" w:sz="4" w:space="0"/>
+        <w:bottom w:val="single" w:color="auto" w:sz="4" w:space="0"/>
+        <w:right w:val="single" w:color="auto" w:sz="4" w:space="0"/>
+        <w:insideH w:val="single" w:color="auto" w:sz="4" w:space="0"/>
+        <w:insideV w:val="single" w:color="auto" w:sz="4" w:space="0"/>
       </w:tblBorders>
     </w:tblPr>
   </w:style>
@@ -2999,14 +4153,14 @@
 </file>
 
 <file path=word/theme/theme1.xml><?xml version="1.0" encoding="utf-8"?>
-<a:theme xmlns:a="http://schemas.openxmlformats.org/drawingml/2006/main" name="Office Theme">
+<a:theme xmlns:a="http://schemas.openxmlformats.org/drawingml/2006/main" xmlns:r="http://schemas.openxmlformats.org/officeDocument/2006/relationships" name="Office Theme">
   <a:themeElements>
     <a:clrScheme name="Office">
       <a:dk1>
-        <a:sysClr val="windowText" lastClr="000000"/>
+        <a:srgbClr val="000000"/>
       </a:dk1>
       <a:lt1>
-        <a:sysClr val="window" lastClr="FFFFFF"/>
+        <a:srgbClr val="FFFFFF"/>
       </a:lt1>
       <a:dk2>
         <a:srgbClr val="1F497D"/>
@@ -3041,242 +4195,134 @@
     </a:clrScheme>
     <a:fontScheme name="Office">
       <a:majorFont>
-        <a:latin typeface="Cambria"/>
+        <a:latin typeface="Cambria" pitchFamily="0" charset="1"/>
         <a:ea typeface=""/>
         <a:cs typeface=""/>
-        <a:font script="Jpan" typeface="ＭＳ ゴシック"/>
-        <a:font script="Hang" typeface="맑은 고딕"/>
-        <a:font script="Hans" typeface="宋体"/>
-        <a:font script="Hant" typeface="新細明體"/>
-        <a:font script="Arab" typeface="Times New Roman"/>
-        <a:font script="Hebr" typeface="Times New Roman"/>
-        <a:font script="Thai" typeface="Angsana New"/>
-        <a:font script="Ethi" typeface="Nyala"/>
-        <a:font script="Beng" typeface="Vrinda"/>
-        <a:font script="Gujr" typeface="Shruti"/>
-        <a:font script="Khmr" typeface="MoolBoran"/>
-        <a:font script="Knda" typeface="Tunga"/>
-        <a:font script="Guru" typeface="Raavi"/>
-        <a:font script="Cans" typeface="Euphemia"/>
-        <a:font script="Cher" typeface="Plantagenet Cherokee"/>
-        <a:font script="Yiii" typeface="Microsoft Yi Baiti"/>
-        <a:font script="Tibt" typeface="Microsoft Himalaya"/>
-        <a:font script="Thaa" typeface="MV Boli"/>
-        <a:font script="Deva" typeface="Mangal"/>
-        <a:font script="Telu" typeface="Gautami"/>
-        <a:font script="Taml" typeface="Latha"/>
-        <a:font script="Syrc" typeface="Estrangelo Edessa"/>
-        <a:font script="Orya" typeface="Kalinga"/>
-        <a:font script="Mlym" typeface="Kartika"/>
-        <a:font script="Laoo" typeface="DokChampa"/>
-        <a:font script="Sinh" typeface="Iskoola Pota"/>
-        <a:font script="Mong" typeface="Mongolian Baiti"/>
-        <a:font script="Viet" typeface="Times New Roman"/>
-        <a:font script="Uigh" typeface="Microsoft Uighur"/>
       </a:majorFont>
       <a:minorFont>
-        <a:latin typeface="Calibri"/>
+        <a:latin typeface="Calibri" pitchFamily="0" charset="1"/>
         <a:ea typeface=""/>
         <a:cs typeface=""/>
-        <a:font script="Jpan" typeface="ＭＳ 明朝"/>
-        <a:font script="Hang" typeface="맑은 고딕"/>
-        <a:font script="Hans" typeface="宋体"/>
-        <a:font script="Hant" typeface="新細明體"/>
-        <a:font script="Arab" typeface="Arial"/>
-        <a:font script="Hebr" typeface="Arial"/>
-        <a:font script="Thai" typeface="Cordia New"/>
-        <a:font script="Ethi" typeface="Nyala"/>
-        <a:font script="Beng" typeface="Vrinda"/>
-        <a:font script="Gujr" typeface="Shruti"/>
-        <a:font script="Khmr" typeface="DaunPenh"/>
-        <a:font script="Knda" typeface="Tunga"/>
-        <a:font script="Guru" typeface="Raavi"/>
-        <a:font script="Cans" typeface="Euphemia"/>
-        <a:font script="Cher" typeface="Plantagenet Cherokee"/>
-        <a:font script="Yiii" typeface="Microsoft Yi Baiti"/>
-        <a:font script="Tibt" typeface="Microsoft Himalaya"/>
-        <a:font script="Thaa" typeface="MV Boli"/>
-        <a:font script="Deva" typeface="Mangal"/>
-        <a:font script="Telu" typeface="Gautami"/>
-        <a:font script="Taml" typeface="Latha"/>
-        <a:font script="Syrc" typeface="Estrangelo Edessa"/>
-        <a:font script="Orya" typeface="Kalinga"/>
-        <a:font script="Mlym" typeface="Kartika"/>
-        <a:font script="Laoo" typeface="DokChampa"/>
-        <a:font script="Sinh" typeface="Iskoola Pota"/>
-        <a:font script="Mong" typeface="Mongolian Baiti"/>
-        <a:font script="Viet" typeface="Arial"/>
-        <a:font script="Uigh" typeface="Microsoft Uighur"/>
       </a:minorFont>
     </a:fontScheme>
-    <a:fmtScheme name="Office">
+    <a:fmtScheme>
       <a:fillStyleLst>
         <a:solidFill>
           <a:schemeClr val="phClr"/>
         </a:solidFill>
-        <a:gradFill rotWithShape="1">
+        <a:gradFill>
           <a:gsLst>
             <a:gs pos="0">
               <a:schemeClr val="phClr">
                 <a:tint val="50000"/>
-                <a:satMod val="300000"/>
               </a:schemeClr>
             </a:gs>
             <a:gs pos="35000">
               <a:schemeClr val="phClr">
                 <a:tint val="37000"/>
-                <a:satMod val="300000"/>
               </a:schemeClr>
             </a:gs>
             <a:gs pos="100000">
               <a:schemeClr val="phClr">
                 <a:tint val="15000"/>
-                <a:satMod val="350000"/>
               </a:schemeClr>
             </a:gs>
           </a:gsLst>
           <a:lin ang="16200000" scaled="1"/>
+          <a:tileRect l="0" t="0" r="0" b="0"/>
         </a:gradFill>
-        <a:gradFill rotWithShape="1">
+        <a:gradFill>
           <a:gsLst>
             <a:gs pos="0">
               <a:schemeClr val="phClr">
                 <a:shade val="51000"/>
-                <a:satMod val="130000"/>
               </a:schemeClr>
             </a:gs>
             <a:gs pos="80000">
               <a:schemeClr val="phClr">
                 <a:shade val="93000"/>
-                <a:satMod val="130000"/>
               </a:schemeClr>
             </a:gs>
             <a:gs pos="100000">
               <a:schemeClr val="phClr">
                 <a:shade val="94000"/>
-                <a:satMod val="135000"/>
               </a:schemeClr>
             </a:gs>
           </a:gsLst>
           <a:lin ang="16200000" scaled="0"/>
+          <a:tileRect l="0" t="0" r="0" b="0"/>
         </a:gradFill>
       </a:fillStyleLst>
       <a:lnStyleLst>
         <a:ln w="9525" cap="flat" cmpd="sng" algn="ctr">
-          <a:solidFill>
-            <a:schemeClr val="phClr">
-              <a:shade val="95000"/>
-              <a:satMod val="105000"/>
-            </a:schemeClr>
-          </a:solidFill>
           <a:prstDash val="solid"/>
         </a:ln>
         <a:ln w="25400" cap="flat" cmpd="sng" algn="ctr">
-          <a:solidFill>
-            <a:schemeClr val="phClr"/>
-          </a:solidFill>
           <a:prstDash val="solid"/>
         </a:ln>
         <a:ln w="38100" cap="flat" cmpd="sng" algn="ctr">
-          <a:solidFill>
-            <a:schemeClr val="phClr"/>
-          </a:solidFill>
           <a:prstDash val="solid"/>
         </a:ln>
       </a:lnStyleLst>
       <a:effectStyleLst>
         <a:effectStyle>
-          <a:effectLst>
-            <a:outerShdw blurRad="40000" dist="20000" dir="5400000" rotWithShape="0">
-              <a:srgbClr val="000000">
-                <a:alpha val="38000"/>
-              </a:srgbClr>
-            </a:outerShdw>
-          </a:effectLst>
+          <a:effectLst/>
         </a:effectStyle>
         <a:effectStyle>
-          <a:effectLst>
-            <a:outerShdw blurRad="40000" dist="23000" dir="5400000" rotWithShape="0">
-              <a:srgbClr val="000000">
-                <a:alpha val="35000"/>
-              </a:srgbClr>
-            </a:outerShdw>
-          </a:effectLst>
+          <a:effectLst/>
         </a:effectStyle>
         <a:effectStyle>
-          <a:effectLst>
-            <a:outerShdw blurRad="40000" dist="23000" dir="5400000" rotWithShape="0">
-              <a:srgbClr val="000000">
-                <a:alpha val="35000"/>
-              </a:srgbClr>
-            </a:outerShdw>
-          </a:effectLst>
-          <a:scene3d>
-            <a:camera prst="orthographicFront">
-              <a:rot lat="0" lon="0" rev="0"/>
-            </a:camera>
-            <a:lightRig rig="threePt" dir="t">
-              <a:rot lat="0" lon="0" rev="1200000"/>
-            </a:lightRig>
-          </a:scene3d>
-          <a:sp3d>
-            <a:bevelT w="63500" h="25400"/>
-          </a:sp3d>
+          <a:effectLst/>
         </a:effectStyle>
       </a:effectStyleLst>
       <a:bgFillStyleLst>
         <a:solidFill>
           <a:schemeClr val="phClr"/>
         </a:solidFill>
-        <a:gradFill rotWithShape="1">
+        <a:gradFill>
           <a:gsLst>
             <a:gs pos="0">
               <a:schemeClr val="phClr">
                 <a:tint val="40000"/>
-                <a:satMod val="350000"/>
               </a:schemeClr>
             </a:gs>
             <a:gs pos="40000">
               <a:schemeClr val="phClr">
                 <a:tint val="45000"/>
                 <a:shade val="99000"/>
-                <a:satMod val="350000"/>
               </a:schemeClr>
             </a:gs>
             <a:gs pos="100000">
               <a:schemeClr val="phClr">
                 <a:shade val="20000"/>
-                <a:satMod val="255000"/>
               </a:schemeClr>
             </a:gs>
           </a:gsLst>
           <a:path path="circle">
             <a:fillToRect l="50000" t="-80000" r="50000" b="180000"/>
           </a:path>
+          <a:tileRect l="0" t="0" r="0" b="0"/>
         </a:gradFill>
-        <a:gradFill rotWithShape="1">
+        <a:gradFill>
           <a:gsLst>
             <a:gs pos="0">
               <a:schemeClr val="phClr">
                 <a:tint val="80000"/>
-                <a:satMod val="300000"/>
               </a:schemeClr>
             </a:gs>
             <a:gs pos="100000">
               <a:schemeClr val="phClr">
                 <a:shade val="30000"/>
-                <a:satMod val="200000"/>
               </a:schemeClr>
             </a:gs>
           </a:gsLst>
           <a:path path="circle">
             <a:fillToRect l="50000" t="50000" r="50000" b="50000"/>
           </a:path>
+          <a:tileRect l="0" t="0" r="0" b="0"/>
         </a:gradFill>
       </a:bgFillStyleLst>
     </a:fmtScheme>
   </a:themeElements>
-  <a:objectDefaults/>
-  <a:extraClrSchemeLst/>
 </a:theme>
 </file>
</xml_diff>